<commit_message>
feat: Add scripts to convert results to DOCX and programmatically update the master thesis conclusion.
</commit_message>
<xml_diff>
--- a/Results_Section.docx
+++ b/Results_Section.docx
@@ -272,7 +272,7 @@
             </w:pPr>
             <w:r>
               <w:rPr>
-                <w:rFonts w:ascii="Arial" w:hAnsi="Arial" w:eastAsia="Times"/>
+                <w:rFonts w:ascii="Times" w:hAnsi="Times" w:eastAsia="Times"/>
                 <w:b/>
                 <w:i w:val="0"/>
                 <w:color w:val="000000"/>
@@ -308,7 +308,7 @@
             </w:pPr>
             <w:r>
               <w:rPr>
-                <w:rFonts w:ascii="Arial" w:hAnsi="Arial" w:eastAsia="Times"/>
+                <w:rFonts w:ascii="Times" w:hAnsi="Times" w:eastAsia="Times"/>
                 <w:b/>
                 <w:i w:val="0"/>
                 <w:color w:val="000000"/>
@@ -349,7 +349,7 @@
             </w:pPr>
             <w:r>
               <w:rPr>
-                <w:rFonts w:ascii="Arial" w:hAnsi="Arial" w:eastAsia="Times"/>
+                <w:rFonts w:ascii="Times" w:hAnsi="Times" w:eastAsia="Times"/>
                 <w:b w:val="0"/>
                 <w:i w:val="0"/>
                 <w:color w:val="000000"/>
@@ -385,7 +385,7 @@
             </w:pPr>
             <w:r>
               <w:rPr>
-                <w:rFonts w:ascii="Arial" w:hAnsi="Arial" w:eastAsia="Times"/>
+                <w:rFonts w:ascii="Times" w:hAnsi="Times" w:eastAsia="Times"/>
                 <w:b w:val="0"/>
                 <w:i w:val="0"/>
                 <w:color w:val="000000"/>
@@ -426,7 +426,7 @@
             </w:pPr>
             <w:r>
               <w:rPr>
-                <w:rFonts w:ascii="Arial" w:hAnsi="Arial" w:eastAsia="Times"/>
+                <w:rFonts w:ascii="Times" w:hAnsi="Times" w:eastAsia="Times"/>
                 <w:b w:val="0"/>
                 <w:i w:val="0"/>
                 <w:color w:val="000000"/>
@@ -462,7 +462,7 @@
             </w:pPr>
             <w:r>
               <w:rPr>
-                <w:rFonts w:ascii="Arial" w:hAnsi="Arial" w:eastAsia="Times"/>
+                <w:rFonts w:ascii="Times" w:hAnsi="Times" w:eastAsia="Times"/>
                 <w:b w:val="0"/>
                 <w:i w:val="0"/>
                 <w:color w:val="000000"/>
@@ -503,7 +503,7 @@
             </w:pPr>
             <w:r>
               <w:rPr>
-                <w:rFonts w:ascii="Arial" w:hAnsi="Arial" w:eastAsia="Times"/>
+                <w:rFonts w:ascii="Times" w:hAnsi="Times" w:eastAsia="Times"/>
                 <w:b w:val="0"/>
                 <w:i w:val="0"/>
                 <w:color w:val="000000"/>
@@ -539,7 +539,7 @@
             </w:pPr>
             <w:r>
               <w:rPr>
-                <w:rFonts w:ascii="Arial" w:hAnsi="Arial" w:eastAsia="Times"/>
+                <w:rFonts w:ascii="Times" w:hAnsi="Times" w:eastAsia="Times"/>
                 <w:b w:val="0"/>
                 <w:i w:val="0"/>
                 <w:color w:val="000000"/>
@@ -580,7 +580,7 @@
             </w:pPr>
             <w:r>
               <w:rPr>
-                <w:rFonts w:ascii="Arial" w:hAnsi="Arial" w:eastAsia="Times"/>
+                <w:rFonts w:ascii="Times" w:hAnsi="Times" w:eastAsia="Times"/>
                 <w:b w:val="0"/>
                 <w:i w:val="0"/>
                 <w:color w:val="000000"/>
@@ -616,7 +616,7 @@
             </w:pPr>
             <w:r>
               <w:rPr>
-                <w:rFonts w:ascii="Arial" w:hAnsi="Arial" w:eastAsia="Times"/>
+                <w:rFonts w:ascii="Times" w:hAnsi="Times" w:eastAsia="Times"/>
                 <w:b w:val="0"/>
                 <w:i w:val="0"/>
                 <w:color w:val="000000"/>
@@ -657,7 +657,7 @@
             </w:pPr>
             <w:r>
               <w:rPr>
-                <w:rFonts w:ascii="Arial" w:hAnsi="Arial" w:eastAsia="Times"/>
+                <w:rFonts w:ascii="Times" w:hAnsi="Times" w:eastAsia="Times"/>
                 <w:b w:val="0"/>
                 <w:i w:val="0"/>
                 <w:color w:val="000000"/>
@@ -693,7 +693,7 @@
             </w:pPr>
             <w:r>
               <w:rPr>
-                <w:rFonts w:ascii="Arial" w:hAnsi="Arial" w:eastAsia="Times"/>
+                <w:rFonts w:ascii="Times" w:hAnsi="Times" w:eastAsia="Times"/>
                 <w:b w:val="0"/>
                 <w:i w:val="0"/>
                 <w:color w:val="000000"/>
@@ -734,7 +734,7 @@
             </w:pPr>
             <w:r>
               <w:rPr>
-                <w:rFonts w:ascii="Arial" w:hAnsi="Arial" w:eastAsia="Times"/>
+                <w:rFonts w:ascii="Times" w:hAnsi="Times" w:eastAsia="Times"/>
                 <w:b w:val="0"/>
                 <w:i w:val="0"/>
                 <w:color w:val="000000"/>
@@ -770,7 +770,7 @@
             </w:pPr>
             <w:r>
               <w:rPr>
-                <w:rFonts w:ascii="Arial" w:hAnsi="Arial" w:eastAsia="Times"/>
+                <w:rFonts w:ascii="Times" w:hAnsi="Times" w:eastAsia="Times"/>
                 <w:b w:val="0"/>
                 <w:i w:val="0"/>
                 <w:color w:val="000000"/>
@@ -811,7 +811,7 @@
             </w:pPr>
             <w:r>
               <w:rPr>
-                <w:rFonts w:ascii="Arial" w:hAnsi="Arial" w:eastAsia="Times"/>
+                <w:rFonts w:ascii="Times" w:hAnsi="Times" w:eastAsia="Times"/>
                 <w:b w:val="0"/>
                 <w:i w:val="0"/>
                 <w:color w:val="000000"/>
@@ -847,7 +847,7 @@
             </w:pPr>
             <w:r>
               <w:rPr>
-                <w:rFonts w:ascii="Arial" w:hAnsi="Arial" w:eastAsia="Times"/>
+                <w:rFonts w:ascii="Times" w:hAnsi="Times" w:eastAsia="Times"/>
                 <w:b w:val="0"/>
                 <w:i w:val="0"/>
                 <w:color w:val="000000"/>
@@ -1193,7 +1193,7 @@
             </w:pPr>
             <w:r>
               <w:rPr>
-                <w:rFonts w:ascii="Arial" w:hAnsi="Arial" w:eastAsia="Symbol"/>
+                <w:rFonts w:ascii="Symbol" w:hAnsi="Symbol" w:eastAsia="Symbol"/>
                 <w:b w:val="0"/>
                 <w:i w:val="0"/>
                 <w:color w:val="000000"/>
@@ -1229,7 +1229,7 @@
             </w:pPr>
             <w:r>
               <w:rPr>
-                <w:rFonts w:ascii="Arial" w:hAnsi="Arial" w:eastAsia="Symbol"/>
+                <w:rFonts w:ascii="Symbol" w:hAnsi="Symbol" w:eastAsia="Symbol"/>
                 <w:b w:val="0"/>
                 <w:i w:val="0"/>
                 <w:color w:val="000000"/>
@@ -1265,7 +1265,7 @@
             </w:pPr>
             <w:r>
               <w:rPr>
-                <w:rFonts w:ascii="Arial" w:hAnsi="Arial" w:eastAsia="Times"/>
+                <w:rFonts w:ascii="Times" w:hAnsi="Times" w:eastAsia="Times"/>
                 <w:b/>
                 <w:i w:val="0"/>
                 <w:color w:val="000000"/>
@@ -1301,7 +1301,7 @@
             </w:pPr>
             <w:r>
               <w:rPr>
-                <w:rFonts w:ascii="Arial" w:hAnsi="Arial" w:eastAsia="Times"/>
+                <w:rFonts w:ascii="Times" w:hAnsi="Times" w:eastAsia="Times"/>
                 <w:b/>
                 <w:i w:val="0"/>
                 <w:color w:val="000000"/>
@@ -1337,7 +1337,7 @@
             </w:pPr>
             <w:r>
               <w:rPr>
-                <w:rFonts w:ascii="Arial" w:hAnsi="Arial" w:eastAsia="Times"/>
+                <w:rFonts w:ascii="Times" w:hAnsi="Times" w:eastAsia="Times"/>
                 <w:b/>
                 <w:i w:val="0"/>
                 <w:color w:val="000000"/>
@@ -1373,7 +1373,7 @@
             </w:pPr>
             <w:r>
               <w:rPr>
-                <w:rFonts w:ascii="Arial" w:hAnsi="Arial" w:eastAsia="Times"/>
+                <w:rFonts w:ascii="Times" w:hAnsi="Times" w:eastAsia="Times"/>
                 <w:b/>
                 <w:i w:val="0"/>
                 <w:color w:val="000000"/>
@@ -1414,7 +1414,7 @@
             </w:pPr>
             <w:r>
               <w:rPr>
-                <w:rFonts w:ascii="Arial" w:hAnsi="Arial" w:eastAsia="Symbol"/>
+                <w:rFonts w:ascii="Symbol" w:hAnsi="Symbol" w:eastAsia="Symbol"/>
                 <w:b w:val="0"/>
                 <w:i w:val="0"/>
                 <w:color w:val="000000"/>
@@ -1424,7 +1424,7 @@
             </w:r>
             <w:r>
               <w:rPr>
-                <w:rFonts w:ascii="Arial" w:hAnsi="Arial" w:eastAsia="Times"/>
+                <w:rFonts w:ascii="Times" w:hAnsi="Times" w:eastAsia="Times"/>
                 <w:b w:val="0"/>
                 <w:i w:val="0"/>
                 <w:color w:val="000000"/>
@@ -1460,7 +1460,7 @@
             </w:pPr>
             <w:r>
               <w:rPr>
-                <w:rFonts w:ascii="Arial" w:hAnsi="Arial" w:eastAsia="Times"/>
+                <w:rFonts w:ascii="Times" w:hAnsi="Times" w:eastAsia="Times"/>
                 <w:b w:val="0"/>
                 <w:i w:val="0"/>
                 <w:color w:val="000000"/>
@@ -1496,7 +1496,7 @@
             </w:pPr>
             <w:r>
               <w:rPr>
-                <w:rFonts w:ascii="Arial" w:hAnsi="Arial" w:eastAsia="Times"/>
+                <w:rFonts w:ascii="Times" w:hAnsi="Times" w:eastAsia="Times"/>
                 <w:b w:val="0"/>
                 <w:i w:val="0"/>
                 <w:color w:val="000000"/>
@@ -1532,7 +1532,7 @@
             </w:pPr>
             <w:r>
               <w:rPr>
-                <w:rFonts w:ascii="Arial" w:hAnsi="Arial" w:eastAsia="Times"/>
+                <w:rFonts w:ascii="Times" w:hAnsi="Times" w:eastAsia="Times"/>
                 <w:b w:val="0"/>
                 <w:i w:val="0"/>
                 <w:color w:val="000000"/>
@@ -1568,7 +1568,7 @@
             </w:pPr>
             <w:r>
               <w:rPr>
-                <w:rFonts w:ascii="Arial" w:hAnsi="Arial" w:eastAsia="Times"/>
+                <w:rFonts w:ascii="Times" w:hAnsi="Times" w:eastAsia="Times"/>
                 <w:b w:val="0"/>
                 <w:i w:val="0"/>
                 <w:color w:val="000000"/>
@@ -1604,7 +1604,7 @@
             </w:pPr>
             <w:r>
               <w:rPr>
-                <w:rFonts w:ascii="Arial" w:hAnsi="Arial" w:eastAsia="Times"/>
+                <w:rFonts w:ascii="Times" w:hAnsi="Times" w:eastAsia="Times"/>
                 <w:b w:val="0"/>
                 <w:i w:val="0"/>
                 <w:color w:val="000000"/>
@@ -1645,7 +1645,7 @@
             </w:pPr>
             <w:r>
               <w:rPr>
-                <w:rFonts w:ascii="Arial" w:hAnsi="Arial" w:eastAsia="Times"/>
+                <w:rFonts w:ascii="Times" w:hAnsi="Times" w:eastAsia="Times"/>
                 <w:b w:val="0"/>
                 <w:i w:val="0"/>
                 <w:color w:val="000000"/>
@@ -1681,7 +1681,7 @@
             </w:pPr>
             <w:r>
               <w:rPr>
-                <w:rFonts w:ascii="Arial" w:hAnsi="Arial" w:eastAsia="Times"/>
+                <w:rFonts w:ascii="Times" w:hAnsi="Times" w:eastAsia="Times"/>
                 <w:b w:val="0"/>
                 <w:i w:val="0"/>
                 <w:color w:val="000000"/>
@@ -1717,7 +1717,7 @@
             </w:pPr>
             <w:r>
               <w:rPr>
-                <w:rFonts w:ascii="Arial" w:hAnsi="Arial" w:eastAsia="Times"/>
+                <w:rFonts w:ascii="Times" w:hAnsi="Times" w:eastAsia="Times"/>
                 <w:b w:val="0"/>
                 <w:i w:val="0"/>
                 <w:color w:val="000000"/>
@@ -1753,7 +1753,7 @@
             </w:pPr>
             <w:r>
               <w:rPr>
-                <w:rFonts w:ascii="Arial" w:hAnsi="Arial" w:eastAsia="Times"/>
+                <w:rFonts w:ascii="Times" w:hAnsi="Times" w:eastAsia="Times"/>
                 <w:b w:val="0"/>
                 <w:i w:val="0"/>
                 <w:color w:val="000000"/>
@@ -1789,7 +1789,7 @@
             </w:pPr>
             <w:r>
               <w:rPr>
-                <w:rFonts w:ascii="Arial" w:hAnsi="Arial" w:eastAsia="Times"/>
+                <w:rFonts w:ascii="Times" w:hAnsi="Times" w:eastAsia="Times"/>
                 <w:b w:val="0"/>
                 <w:i w:val="0"/>
                 <w:color w:val="000000"/>
@@ -1825,7 +1825,7 @@
             </w:pPr>
             <w:r>
               <w:rPr>
-                <w:rFonts w:ascii="Arial" w:hAnsi="Arial" w:eastAsia="Times"/>
+                <w:rFonts w:ascii="Times" w:hAnsi="Times" w:eastAsia="Times"/>
                 <w:b w:val="0"/>
                 <w:i w:val="0"/>
                 <w:color w:val="000000"/>
@@ -1866,7 +1866,7 @@
             </w:pPr>
             <w:r>
               <w:rPr>
-                <w:rFonts w:ascii="Arial" w:hAnsi="Arial" w:eastAsia="Times"/>
+                <w:rFonts w:ascii="Times" w:hAnsi="Times" w:eastAsia="Times"/>
                 <w:b w:val="0"/>
                 <w:i w:val="0"/>
                 <w:color w:val="000000"/>
@@ -1902,7 +1902,7 @@
             </w:pPr>
             <w:r>
               <w:rPr>
-                <w:rFonts w:ascii="Arial" w:hAnsi="Arial" w:eastAsia="Times"/>
+                <w:rFonts w:ascii="Times" w:hAnsi="Times" w:eastAsia="Times"/>
                 <w:b w:val="0"/>
                 <w:i w:val="0"/>
                 <w:color w:val="000000"/>
@@ -1938,7 +1938,7 @@
             </w:pPr>
             <w:r>
               <w:rPr>
-                <w:rFonts w:ascii="Arial" w:hAnsi="Arial" w:eastAsia="Times"/>
+                <w:rFonts w:ascii="Times" w:hAnsi="Times" w:eastAsia="Times"/>
                 <w:b w:val="0"/>
                 <w:i w:val="0"/>
                 <w:color w:val="000000"/>
@@ -1974,7 +1974,7 @@
             </w:pPr>
             <w:r>
               <w:rPr>
-                <w:rFonts w:ascii="Arial" w:hAnsi="Arial" w:eastAsia="Times"/>
+                <w:rFonts w:ascii="Times" w:hAnsi="Times" w:eastAsia="Times"/>
                 <w:b w:val="0"/>
                 <w:i w:val="0"/>
                 <w:color w:val="000000"/>
@@ -2010,7 +2010,7 @@
             </w:pPr>
             <w:r>
               <w:rPr>
-                <w:rFonts w:ascii="Arial" w:hAnsi="Arial" w:eastAsia="Times"/>
+                <w:rFonts w:ascii="Times" w:hAnsi="Times" w:eastAsia="Times"/>
                 <w:b w:val="0"/>
                 <w:i w:val="0"/>
                 <w:color w:val="000000"/>
@@ -2046,7 +2046,7 @@
             </w:pPr>
             <w:r>
               <w:rPr>
-                <w:rFonts w:ascii="Arial" w:hAnsi="Arial" w:eastAsia="Times"/>
+                <w:rFonts w:ascii="Times" w:hAnsi="Times" w:eastAsia="Times"/>
                 <w:b w:val="0"/>
                 <w:i w:val="0"/>
                 <w:color w:val="000000"/>
@@ -2087,7 +2087,7 @@
             </w:pPr>
             <w:r>
               <w:rPr>
-                <w:rFonts w:ascii="Arial" w:hAnsi="Arial" w:eastAsia="Times"/>
+                <w:rFonts w:ascii="Times" w:hAnsi="Times" w:eastAsia="Times"/>
                 <w:b w:val="0"/>
                 <w:i w:val="0"/>
                 <w:color w:val="000000"/>
@@ -2123,7 +2123,7 @@
             </w:pPr>
             <w:r>
               <w:rPr>
-                <w:rFonts w:ascii="Arial" w:hAnsi="Arial" w:eastAsia="Times"/>
+                <w:rFonts w:ascii="Times" w:hAnsi="Times" w:eastAsia="Times"/>
                 <w:b w:val="0"/>
                 <w:i w:val="0"/>
                 <w:color w:val="000000"/>
@@ -2159,7 +2159,7 @@
             </w:pPr>
             <w:r>
               <w:rPr>
-                <w:rFonts w:ascii="Arial" w:hAnsi="Arial" w:eastAsia="Times"/>
+                <w:rFonts w:ascii="Times" w:hAnsi="Times" w:eastAsia="Times"/>
                 <w:b w:val="0"/>
                 <w:i w:val="0"/>
                 <w:color w:val="000000"/>
@@ -2195,7 +2195,7 @@
             </w:pPr>
             <w:r>
               <w:rPr>
-                <w:rFonts w:ascii="Arial" w:hAnsi="Arial" w:eastAsia="Times"/>
+                <w:rFonts w:ascii="Times" w:hAnsi="Times" w:eastAsia="Times"/>
                 <w:b w:val="0"/>
                 <w:i w:val="0"/>
                 <w:color w:val="000000"/>
@@ -2231,7 +2231,7 @@
             </w:pPr>
             <w:r>
               <w:rPr>
-                <w:rFonts w:ascii="Arial" w:hAnsi="Arial" w:eastAsia="Times"/>
+                <w:rFonts w:ascii="Times" w:hAnsi="Times" w:eastAsia="Times"/>
                 <w:b w:val="0"/>
                 <w:i w:val="0"/>
                 <w:color w:val="000000"/>
@@ -2267,7 +2267,7 @@
             </w:pPr>
             <w:r>
               <w:rPr>
-                <w:rFonts w:ascii="Arial" w:hAnsi="Arial" w:eastAsia="Times"/>
+                <w:rFonts w:ascii="Times" w:hAnsi="Times" w:eastAsia="Times"/>
                 <w:b w:val="0"/>
                 <w:i w:val="0"/>
                 <w:color w:val="000000"/>
@@ -2308,7 +2308,7 @@
             </w:pPr>
             <w:r>
               <w:rPr>
-                <w:rFonts w:ascii="Arial" w:hAnsi="Arial" w:eastAsia="Times"/>
+                <w:rFonts w:ascii="Times" w:hAnsi="Times" w:eastAsia="Times"/>
                 <w:b w:val="0"/>
                 <w:i w:val="0"/>
                 <w:color w:val="000000"/>
@@ -2344,7 +2344,7 @@
             </w:pPr>
             <w:r>
               <w:rPr>
-                <w:rFonts w:ascii="Arial" w:hAnsi="Arial" w:eastAsia="Times"/>
+                <w:rFonts w:ascii="Times" w:hAnsi="Times" w:eastAsia="Times"/>
                 <w:b w:val="0"/>
                 <w:i w:val="0"/>
                 <w:color w:val="000000"/>
@@ -2380,7 +2380,7 @@
             </w:pPr>
             <w:r>
               <w:rPr>
-                <w:rFonts w:ascii="Arial" w:hAnsi="Arial" w:eastAsia="Times"/>
+                <w:rFonts w:ascii="Times" w:hAnsi="Times" w:eastAsia="Times"/>
                 <w:b w:val="0"/>
                 <w:i w:val="0"/>
                 <w:color w:val="000000"/>
@@ -2416,7 +2416,7 @@
             </w:pPr>
             <w:r>
               <w:rPr>
-                <w:rFonts w:ascii="Arial" w:hAnsi="Arial" w:eastAsia="Times"/>
+                <w:rFonts w:ascii="Times" w:hAnsi="Times" w:eastAsia="Times"/>
                 <w:b w:val="0"/>
                 <w:i w:val="0"/>
                 <w:color w:val="000000"/>
@@ -2452,7 +2452,7 @@
             </w:pPr>
             <w:r>
               <w:rPr>
-                <w:rFonts w:ascii="Arial" w:hAnsi="Arial" w:eastAsia="Times"/>
+                <w:rFonts w:ascii="Times" w:hAnsi="Times" w:eastAsia="Times"/>
                 <w:b w:val="0"/>
                 <w:i w:val="0"/>
                 <w:color w:val="000000"/>
@@ -2488,7 +2488,7 @@
             </w:pPr>
             <w:r>
               <w:rPr>
-                <w:rFonts w:ascii="Arial" w:hAnsi="Arial" w:eastAsia="Times"/>
+                <w:rFonts w:ascii="Times" w:hAnsi="Times" w:eastAsia="Times"/>
                 <w:b w:val="0"/>
                 <w:i w:val="0"/>
                 <w:color w:val="000000"/>
@@ -3005,7 +3005,7 @@
             </w:pPr>
             <w:r>
               <w:rPr>
-                <w:rFonts w:ascii="Arial" w:hAnsi="Arial" w:eastAsia="Symbol"/>
+                <w:rFonts w:ascii="Symbol" w:hAnsi="Symbol" w:eastAsia="Symbol"/>
                 <w:b w:val="0"/>
                 <w:i w:val="0"/>
                 <w:color w:val="000000"/>
@@ -3041,7 +3041,7 @@
             </w:pPr>
             <w:r>
               <w:rPr>
-                <w:rFonts w:ascii="Arial" w:hAnsi="Arial" w:eastAsia="Times"/>
+                <w:rFonts w:ascii="Times" w:hAnsi="Times" w:eastAsia="Times"/>
                 <w:b/>
                 <w:i w:val="0"/>
                 <w:color w:val="000000"/>
@@ -3077,7 +3077,7 @@
             </w:pPr>
             <w:r>
               <w:rPr>
-                <w:rFonts w:ascii="Arial" w:hAnsi="Arial" w:eastAsia="Times"/>
+                <w:rFonts w:ascii="Times" w:hAnsi="Times" w:eastAsia="Times"/>
                 <w:b/>
                 <w:i w:val="0"/>
                 <w:color w:val="000000"/>
@@ -3118,7 +3118,7 @@
             </w:pPr>
             <w:r>
               <w:rPr>
-                <w:rFonts w:ascii="Arial" w:hAnsi="Arial" w:eastAsia="Symbol"/>
+                <w:rFonts w:ascii="Symbol" w:hAnsi="Symbol" w:eastAsia="Symbol"/>
                 <w:b w:val="0"/>
                 <w:i w:val="0"/>
                 <w:color w:val="000000"/>
@@ -3128,7 +3128,7 @@
             </w:r>
             <w:r>
               <w:rPr>
-                <w:rFonts w:ascii="Arial" w:hAnsi="Arial" w:eastAsia="Times"/>
+                <w:rFonts w:ascii="Times" w:hAnsi="Times" w:eastAsia="Times"/>
                 <w:b w:val="0"/>
                 <w:i w:val="0"/>
                 <w:color w:val="000000"/>
@@ -3164,7 +3164,7 @@
             </w:pPr>
             <w:r>
               <w:rPr>
-                <w:rFonts w:ascii="Arial" w:hAnsi="Arial" w:eastAsia="Times"/>
+                <w:rFonts w:ascii="Times" w:hAnsi="Times" w:eastAsia="Times"/>
                 <w:b w:val="0"/>
                 <w:i w:val="0"/>
                 <w:color w:val="000000"/>
@@ -3200,7 +3200,7 @@
             </w:pPr>
             <w:r>
               <w:rPr>
-                <w:rFonts w:ascii="Arial" w:hAnsi="Arial" w:eastAsia="Times"/>
+                <w:rFonts w:ascii="Times" w:hAnsi="Times" w:eastAsia="Times"/>
                 <w:b w:val="0"/>
                 <w:i w:val="0"/>
                 <w:color w:val="000000"/>
@@ -3241,7 +3241,7 @@
             </w:pPr>
             <w:r>
               <w:rPr>
-                <w:rFonts w:ascii="Arial" w:hAnsi="Arial" w:eastAsia="Times"/>
+                <w:rFonts w:ascii="Times" w:hAnsi="Times" w:eastAsia="Times"/>
                 <w:b w:val="0"/>
                 <w:i w:val="0"/>
                 <w:color w:val="000000"/>
@@ -3277,7 +3277,7 @@
             </w:pPr>
             <w:r>
               <w:rPr>
-                <w:rFonts w:ascii="Arial" w:hAnsi="Arial" w:eastAsia="Times"/>
+                <w:rFonts w:ascii="Times" w:hAnsi="Times" w:eastAsia="Times"/>
                 <w:b w:val="0"/>
                 <w:i w:val="0"/>
                 <w:color w:val="000000"/>
@@ -3313,7 +3313,7 @@
             </w:pPr>
             <w:r>
               <w:rPr>
-                <w:rFonts w:ascii="Arial" w:hAnsi="Arial" w:eastAsia="Times"/>
+                <w:rFonts w:ascii="Times" w:hAnsi="Times" w:eastAsia="Times"/>
                 <w:b w:val="0"/>
                 <w:i w:val="0"/>
                 <w:color w:val="000000"/>
@@ -3354,7 +3354,7 @@
             </w:pPr>
             <w:r>
               <w:rPr>
-                <w:rFonts w:ascii="Arial" w:hAnsi="Arial" w:eastAsia="Times"/>
+                <w:rFonts w:ascii="Times" w:hAnsi="Times" w:eastAsia="Times"/>
                 <w:b w:val="0"/>
                 <w:i w:val="0"/>
                 <w:color w:val="000000"/>
@@ -3390,7 +3390,7 @@
             </w:pPr>
             <w:r>
               <w:rPr>
-                <w:rFonts w:ascii="Arial" w:hAnsi="Arial" w:eastAsia="Times"/>
+                <w:rFonts w:ascii="Times" w:hAnsi="Times" w:eastAsia="Times"/>
                 <w:b w:val="0"/>
                 <w:i w:val="0"/>
                 <w:color w:val="000000"/>
@@ -3426,7 +3426,7 @@
             </w:pPr>
             <w:r>
               <w:rPr>
-                <w:rFonts w:ascii="Arial" w:hAnsi="Arial" w:eastAsia="Times"/>
+                <w:rFonts w:ascii="Times" w:hAnsi="Times" w:eastAsia="Times"/>
                 <w:b w:val="0"/>
                 <w:i w:val="0"/>
                 <w:color w:val="000000"/>
@@ -3467,7 +3467,7 @@
             </w:pPr>
             <w:r>
               <w:rPr>
-                <w:rFonts w:ascii="Arial" w:hAnsi="Arial" w:eastAsia="Times"/>
+                <w:rFonts w:ascii="Times" w:hAnsi="Times" w:eastAsia="Times"/>
                 <w:b w:val="0"/>
                 <w:i w:val="0"/>
                 <w:color w:val="000000"/>
@@ -3503,7 +3503,7 @@
             </w:pPr>
             <w:r>
               <w:rPr>
-                <w:rFonts w:ascii="Arial" w:hAnsi="Arial" w:eastAsia="Times"/>
+                <w:rFonts w:ascii="Times" w:hAnsi="Times" w:eastAsia="Times"/>
                 <w:b w:val="0"/>
                 <w:i w:val="0"/>
                 <w:color w:val="000000"/>
@@ -3539,7 +3539,7 @@
             </w:pPr>
             <w:r>
               <w:rPr>
-                <w:rFonts w:ascii="Arial" w:hAnsi="Arial" w:eastAsia="Times"/>
+                <w:rFonts w:ascii="Times" w:hAnsi="Times" w:eastAsia="Times"/>
                 <w:b w:val="0"/>
                 <w:i w:val="0"/>
                 <w:color w:val="000000"/>
@@ -3580,7 +3580,7 @@
             </w:pPr>
             <w:r>
               <w:rPr>
-                <w:rFonts w:ascii="Arial" w:hAnsi="Arial" w:eastAsia="Times"/>
+                <w:rFonts w:ascii="Times" w:hAnsi="Times" w:eastAsia="Times"/>
                 <w:b w:val="0"/>
                 <w:i w:val="0"/>
                 <w:color w:val="000000"/>
@@ -3616,7 +3616,7 @@
             </w:pPr>
             <w:r>
               <w:rPr>
-                <w:rFonts w:ascii="Arial" w:hAnsi="Arial" w:eastAsia="Times"/>
+                <w:rFonts w:ascii="Times" w:hAnsi="Times" w:eastAsia="Times"/>
                 <w:b w:val="0"/>
                 <w:i w:val="0"/>
                 <w:color w:val="000000"/>
@@ -3652,7 +3652,7 @@
             </w:pPr>
             <w:r>
               <w:rPr>
-                <w:rFonts w:ascii="Arial" w:hAnsi="Arial" w:eastAsia="Times"/>
+                <w:rFonts w:ascii="Times" w:hAnsi="Times" w:eastAsia="Times"/>
                 <w:b w:val="0"/>
                 <w:i w:val="0"/>
                 <w:color w:val="000000"/>
@@ -3887,7 +3887,7 @@
             </w:pPr>
             <w:r>
               <w:rPr>
-                <w:rFonts w:ascii="Arial" w:hAnsi="Arial" w:eastAsia="Symbol"/>
+                <w:rFonts w:ascii="Symbol" w:hAnsi="Symbol" w:eastAsia="Symbol"/>
                 <w:b w:val="0"/>
                 <w:i w:val="0"/>
                 <w:color w:val="000000"/>
@@ -3923,7 +3923,7 @@
             </w:pPr>
             <w:r>
               <w:rPr>
-                <w:rFonts w:ascii="Arial" w:hAnsi="Arial" w:eastAsia="Times"/>
+                <w:rFonts w:ascii="Times" w:hAnsi="Times" w:eastAsia="Times"/>
                 <w:b/>
                 <w:i w:val="0"/>
                 <w:color w:val="000000"/>
@@ -3959,7 +3959,7 @@
             </w:pPr>
             <w:r>
               <w:rPr>
-                <w:rFonts w:ascii="Arial" w:hAnsi="Arial" w:eastAsia="Times"/>
+                <w:rFonts w:ascii="Times" w:hAnsi="Times" w:eastAsia="Times"/>
                 <w:b/>
                 <w:i w:val="0"/>
                 <w:color w:val="000000"/>
@@ -3995,7 +3995,7 @@
             </w:pPr>
             <w:r>
               <w:rPr>
-                <w:rFonts w:ascii="Arial" w:hAnsi="Arial" w:eastAsia="Times"/>
+                <w:rFonts w:ascii="Times" w:hAnsi="Times" w:eastAsia="Times"/>
                 <w:b/>
                 <w:i w:val="0"/>
                 <w:color w:val="000000"/>
@@ -4036,7 +4036,7 @@
             </w:pPr>
             <w:r>
               <w:rPr>
-                <w:rFonts w:ascii="Arial" w:hAnsi="Arial" w:eastAsia="Times"/>
+                <w:rFonts w:ascii="Times" w:hAnsi="Times" w:eastAsia="Times"/>
                 <w:b w:val="0"/>
                 <w:i w:val="0"/>
                 <w:color w:val="000000"/>
@@ -4072,7 +4072,7 @@
             </w:pPr>
             <w:r>
               <w:rPr>
-                <w:rFonts w:ascii="Arial" w:hAnsi="Arial" w:eastAsia="Times"/>
+                <w:rFonts w:ascii="Times" w:hAnsi="Times" w:eastAsia="Times"/>
                 <w:b w:val="0"/>
                 <w:i w:val="0"/>
                 <w:color w:val="000000"/>
@@ -4108,7 +4108,7 @@
             </w:pPr>
             <w:r>
               <w:rPr>
-                <w:rFonts w:ascii="Arial" w:hAnsi="Arial" w:eastAsia="Times"/>
+                <w:rFonts w:ascii="Times" w:hAnsi="Times" w:eastAsia="Times"/>
                 <w:b w:val="0"/>
                 <w:i w:val="0"/>
                 <w:color w:val="000000"/>
@@ -4144,7 +4144,7 @@
             </w:pPr>
             <w:r>
               <w:rPr>
-                <w:rFonts w:ascii="Arial" w:hAnsi="Arial" w:eastAsia="Times"/>
+                <w:rFonts w:ascii="Times" w:hAnsi="Times" w:eastAsia="Times"/>
                 <w:b w:val="0"/>
                 <w:i w:val="0"/>
                 <w:color w:val="000000"/>
@@ -4185,7 +4185,7 @@
             </w:pPr>
             <w:r>
               <w:rPr>
-                <w:rFonts w:ascii="Arial" w:hAnsi="Arial" w:eastAsia="Symbol"/>
+                <w:rFonts w:ascii="Symbol" w:hAnsi="Symbol" w:eastAsia="Symbol"/>
                 <w:b w:val="0"/>
                 <w:i w:val="0"/>
                 <w:color w:val="000000"/>
@@ -4195,7 +4195,7 @@
             </w:r>
             <w:r>
               <w:rPr>
-                <w:rFonts w:ascii="Arial" w:hAnsi="Arial" w:eastAsia="Times"/>
+                <w:rFonts w:ascii="Times" w:hAnsi="Times" w:eastAsia="Times"/>
                 <w:b w:val="0"/>
                 <w:i w:val="0"/>
                 <w:color w:val="000000"/>
@@ -4231,7 +4231,7 @@
             </w:pPr>
             <w:r>
               <w:rPr>
-                <w:rFonts w:ascii="Arial" w:hAnsi="Arial" w:eastAsia="Times"/>
+                <w:rFonts w:ascii="Times" w:hAnsi="Times" w:eastAsia="Times"/>
                 <w:b w:val="0"/>
                 <w:i w:val="0"/>
                 <w:color w:val="000000"/>
@@ -4267,7 +4267,7 @@
             </w:pPr>
             <w:r>
               <w:rPr>
-                <w:rFonts w:ascii="Arial" w:hAnsi="Arial" w:eastAsia="Times"/>
+                <w:rFonts w:ascii="Times" w:hAnsi="Times" w:eastAsia="Times"/>
                 <w:b w:val="0"/>
                 <w:i w:val="0"/>
                 <w:color w:val="000000"/>
@@ -4303,7 +4303,7 @@
             </w:pPr>
             <w:r>
               <w:rPr>
-                <w:rFonts w:ascii="Arial" w:hAnsi="Arial" w:eastAsia="Times"/>
+                <w:rFonts w:ascii="Times" w:hAnsi="Times" w:eastAsia="Times"/>
                 <w:b w:val="0"/>
                 <w:i w:val="0"/>
                 <w:color w:val="000000"/>
@@ -4344,7 +4344,7 @@
             </w:pPr>
             <w:r>
               <w:rPr>
-                <w:rFonts w:ascii="Arial" w:hAnsi="Arial" w:eastAsia="Times"/>
+                <w:rFonts w:ascii="Times" w:hAnsi="Times" w:eastAsia="Times"/>
                 <w:b w:val="0"/>
                 <w:i w:val="0"/>
                 <w:color w:val="000000"/>
@@ -4380,7 +4380,7 @@
             </w:pPr>
             <w:r>
               <w:rPr>
-                <w:rFonts w:ascii="Arial" w:hAnsi="Arial" w:eastAsia="Times"/>
+                <w:rFonts w:ascii="Times" w:hAnsi="Times" w:eastAsia="Times"/>
                 <w:b w:val="0"/>
                 <w:i w:val="0"/>
                 <w:color w:val="000000"/>
@@ -4416,7 +4416,7 @@
             </w:pPr>
             <w:r>
               <w:rPr>
-                <w:rFonts w:ascii="Arial" w:hAnsi="Arial" w:eastAsia="Times"/>
+                <w:rFonts w:ascii="Times" w:hAnsi="Times" w:eastAsia="Times"/>
                 <w:b w:val="0"/>
                 <w:i w:val="0"/>
                 <w:color w:val="000000"/>
@@ -4452,7 +4452,7 @@
             </w:pPr>
             <w:r>
               <w:rPr>
-                <w:rFonts w:ascii="Arial" w:hAnsi="Arial" w:eastAsia="Times"/>
+                <w:rFonts w:ascii="Times" w:hAnsi="Times" w:eastAsia="Times"/>
                 <w:b w:val="0"/>
                 <w:i w:val="0"/>
                 <w:color w:val="000000"/>
@@ -4535,7 +4535,7 @@
             </w:pPr>
             <w:r>
               <w:rPr>
-                <w:rFonts w:ascii="Arial" w:hAnsi="Arial" w:eastAsia="Symbol"/>
+                <w:rFonts w:ascii="Symbol" w:hAnsi="Symbol" w:eastAsia="Symbol"/>
                 <w:b w:val="0"/>
                 <w:i w:val="0"/>
                 <w:color w:val="000000"/>
@@ -4571,7 +4571,7 @@
             </w:pPr>
             <w:r>
               <w:rPr>
-                <w:rFonts w:ascii="Arial" w:hAnsi="Arial" w:eastAsia="Times"/>
+                <w:rFonts w:ascii="Times" w:hAnsi="Times" w:eastAsia="Times"/>
                 <w:b/>
                 <w:i w:val="0"/>
                 <w:color w:val="000000"/>
@@ -4607,7 +4607,7 @@
             </w:pPr>
             <w:r>
               <w:rPr>
-                <w:rFonts w:ascii="Arial" w:hAnsi="Arial" w:eastAsia="Times"/>
+                <w:rFonts w:ascii="Times" w:hAnsi="Times" w:eastAsia="Times"/>
                 <w:b/>
                 <w:i w:val="0"/>
                 <w:color w:val="000000"/>
@@ -4643,7 +4643,7 @@
             </w:pPr>
             <w:r>
               <w:rPr>
-                <w:rFonts w:ascii="Arial" w:hAnsi="Arial" w:eastAsia="Times"/>
+                <w:rFonts w:ascii="Times" w:hAnsi="Times" w:eastAsia="Times"/>
                 <w:b/>
                 <w:i w:val="0"/>
                 <w:color w:val="000000"/>
@@ -4684,7 +4684,7 @@
             </w:pPr>
             <w:r>
               <w:rPr>
-                <w:rFonts w:ascii="Arial" w:hAnsi="Arial" w:eastAsia="Times"/>
+                <w:rFonts w:ascii="Times" w:hAnsi="Times" w:eastAsia="Times"/>
                 <w:b w:val="0"/>
                 <w:i w:val="0"/>
                 <w:color w:val="000000"/>
@@ -4720,7 +4720,7 @@
             </w:pPr>
             <w:r>
               <w:rPr>
-                <w:rFonts w:ascii="Arial" w:hAnsi="Arial" w:eastAsia="Times"/>
+                <w:rFonts w:ascii="Times" w:hAnsi="Times" w:eastAsia="Times"/>
                 <w:b w:val="0"/>
                 <w:i w:val="0"/>
                 <w:color w:val="000000"/>
@@ -4756,7 +4756,7 @@
             </w:pPr>
             <w:r>
               <w:rPr>
-                <w:rFonts w:ascii="Arial" w:hAnsi="Arial" w:eastAsia="Times"/>
+                <w:rFonts w:ascii="Times" w:hAnsi="Times" w:eastAsia="Times"/>
                 <w:b w:val="0"/>
                 <w:i w:val="0"/>
                 <w:color w:val="000000"/>
@@ -4792,7 +4792,7 @@
             </w:pPr>
             <w:r>
               <w:rPr>
-                <w:rFonts w:ascii="Arial" w:hAnsi="Arial" w:eastAsia="Times"/>
+                <w:rFonts w:ascii="Times" w:hAnsi="Times" w:eastAsia="Times"/>
                 <w:b w:val="0"/>
                 <w:i w:val="0"/>
                 <w:color w:val="000000"/>
@@ -4833,7 +4833,7 @@
             </w:pPr>
             <w:r>
               <w:rPr>
-                <w:rFonts w:ascii="Arial" w:hAnsi="Arial" w:eastAsia="Times"/>
+                <w:rFonts w:ascii="Times" w:hAnsi="Times" w:eastAsia="Times"/>
                 <w:b w:val="0"/>
                 <w:i w:val="0"/>
                 <w:color w:val="000000"/>
@@ -4869,7 +4869,7 @@
             </w:pPr>
             <w:r>
               <w:rPr>
-                <w:rFonts w:ascii="Arial" w:hAnsi="Arial" w:eastAsia="Times"/>
+                <w:rFonts w:ascii="Times" w:hAnsi="Times" w:eastAsia="Times"/>
                 <w:b w:val="0"/>
                 <w:i w:val="0"/>
                 <w:color w:val="000000"/>
@@ -4905,7 +4905,7 @@
             </w:pPr>
             <w:r>
               <w:rPr>
-                <w:rFonts w:ascii="Arial" w:hAnsi="Arial" w:eastAsia="Times"/>
+                <w:rFonts w:ascii="Times" w:hAnsi="Times" w:eastAsia="Times"/>
                 <w:b w:val="0"/>
                 <w:i w:val="0"/>
                 <w:color w:val="000000"/>
@@ -4941,7 +4941,7 @@
             </w:pPr>
             <w:r>
               <w:rPr>
-                <w:rFonts w:ascii="Arial" w:hAnsi="Arial" w:eastAsia="Times"/>
+                <w:rFonts w:ascii="Times" w:hAnsi="Times" w:eastAsia="Times"/>
                 <w:b w:val="0"/>
                 <w:i w:val="0"/>
                 <w:color w:val="000000"/>
@@ -4982,7 +4982,7 @@
             </w:pPr>
             <w:r>
               <w:rPr>
-                <w:rFonts w:ascii="Arial" w:hAnsi="Arial" w:eastAsia="Times"/>
+                <w:rFonts w:ascii="Times" w:hAnsi="Times" w:eastAsia="Times"/>
                 <w:b w:val="0"/>
                 <w:i w:val="0"/>
                 <w:color w:val="000000"/>
@@ -5018,7 +5018,7 @@
             </w:pPr>
             <w:r>
               <w:rPr>
-                <w:rFonts w:ascii="Arial" w:hAnsi="Arial" w:eastAsia="Times"/>
+                <w:rFonts w:ascii="Times" w:hAnsi="Times" w:eastAsia="Times"/>
                 <w:b w:val="0"/>
                 <w:i w:val="0"/>
                 <w:color w:val="000000"/>
@@ -5054,7 +5054,7 @@
             </w:pPr>
             <w:r>
               <w:rPr>
-                <w:rFonts w:ascii="Arial" w:hAnsi="Arial" w:eastAsia="Times"/>
+                <w:rFonts w:ascii="Times" w:hAnsi="Times" w:eastAsia="Times"/>
                 <w:b w:val="0"/>
                 <w:i w:val="0"/>
                 <w:color w:val="000000"/>
@@ -5090,7 +5090,7 @@
             </w:pPr>
             <w:r>
               <w:rPr>
-                <w:rFonts w:ascii="Arial" w:hAnsi="Arial" w:eastAsia="Times"/>
+                <w:rFonts w:ascii="Times" w:hAnsi="Times" w:eastAsia="Times"/>
                 <w:b w:val="0"/>
                 <w:i w:val="0"/>
                 <w:color w:val="000000"/>
@@ -5853,7 +5853,7 @@
             </w:pPr>
             <w:r>
               <w:rPr>
-                <w:rFonts w:ascii="Arial" w:hAnsi="Arial" w:eastAsia="Symbol"/>
+                <w:rFonts w:ascii="Symbol" w:hAnsi="Symbol" w:eastAsia="Symbol"/>
                 <w:b w:val="0"/>
                 <w:i w:val="0"/>
                 <w:color w:val="000000"/>
@@ -5889,7 +5889,7 @@
             </w:pPr>
             <w:r>
               <w:rPr>
-                <w:rFonts w:ascii="Arial" w:hAnsi="Arial" w:eastAsia="Times"/>
+                <w:rFonts w:ascii="Times" w:hAnsi="Times" w:eastAsia="Times"/>
                 <w:b/>
                 <w:i w:val="0"/>
                 <w:color w:val="000000"/>
@@ -5898,14 +5898,11 @@
               <w:t xml:space="preserve">MIA </w:t>
             </w:r>
             <w:r>
-              <w:rPr>
-                <w:rFonts w:ascii="Arial" w:hAnsi="Arial"/>
-              </w:rPr>
               <w:br/>
             </w:r>
             <w:r>
               <w:rPr>
-                <w:rFonts w:ascii="Arial" w:hAnsi="Arial" w:eastAsia="Times"/>
+                <w:rFonts w:ascii="Times" w:hAnsi="Times" w:eastAsia="Times"/>
                 <w:b/>
                 <w:i w:val="0"/>
                 <w:color w:val="000000"/>
@@ -5941,7 +5938,7 @@
             </w:pPr>
             <w:r>
               <w:rPr>
-                <w:rFonts w:ascii="Arial" w:hAnsi="Arial" w:eastAsia="Times"/>
+                <w:rFonts w:ascii="Times" w:hAnsi="Times" w:eastAsia="Times"/>
                 <w:b/>
                 <w:i w:val="0"/>
                 <w:color w:val="000000"/>
@@ -5950,14 +5947,11 @@
               <w:t xml:space="preserve">MIA </w:t>
             </w:r>
             <w:r>
-              <w:rPr>
-                <w:rFonts w:ascii="Arial" w:hAnsi="Arial"/>
-              </w:rPr>
               <w:br/>
             </w:r>
             <w:r>
               <w:rPr>
-                <w:rFonts w:ascii="Arial" w:hAnsi="Arial" w:eastAsia="Times"/>
+                <w:rFonts w:ascii="Times" w:hAnsi="Times" w:eastAsia="Times"/>
                 <w:b/>
                 <w:i w:val="0"/>
                 <w:color w:val="000000"/>
@@ -5993,7 +5987,7 @@
             </w:pPr>
             <w:r>
               <w:rPr>
-                <w:rFonts w:ascii="Arial" w:hAnsi="Arial" w:eastAsia="Times"/>
+                <w:rFonts w:ascii="Times" w:hAnsi="Times" w:eastAsia="Times"/>
                 <w:b/>
                 <w:i w:val="0"/>
                 <w:color w:val="000000"/>
@@ -6029,7 +6023,7 @@
             </w:pPr>
             <w:r>
               <w:rPr>
-                <w:rFonts w:ascii="Arial" w:hAnsi="Arial" w:eastAsia="Times"/>
+                <w:rFonts w:ascii="Times" w:hAnsi="Times" w:eastAsia="Times"/>
                 <w:b/>
                 <w:i w:val="0"/>
                 <w:color w:val="000000"/>
@@ -6065,7 +6059,7 @@
             </w:pPr>
             <w:r>
               <w:rPr>
-                <w:rFonts w:ascii="Arial" w:hAnsi="Arial" w:eastAsia="Times"/>
+                <w:rFonts w:ascii="Times" w:hAnsi="Times" w:eastAsia="Times"/>
                 <w:b/>
                 <w:i w:val="0"/>
                 <w:color w:val="000000"/>
@@ -6106,7 +6100,7 @@
             </w:pPr>
             <w:r>
               <w:rPr>
-                <w:rFonts w:ascii="Arial" w:hAnsi="Arial" w:eastAsia="Symbol"/>
+                <w:rFonts w:ascii="Symbol" w:hAnsi="Symbol" w:eastAsia="Symbol"/>
                 <w:b w:val="0"/>
                 <w:i w:val="0"/>
                 <w:color w:val="000000"/>
@@ -6116,7 +6110,7 @@
             </w:r>
             <w:r>
               <w:rPr>
-                <w:rFonts w:ascii="Arial" w:hAnsi="Arial" w:eastAsia="Times"/>
+                <w:rFonts w:ascii="Times" w:hAnsi="Times" w:eastAsia="Times"/>
                 <w:b w:val="0"/>
                 <w:i w:val="0"/>
                 <w:color w:val="000000"/>
@@ -6152,7 +6146,7 @@
             </w:pPr>
             <w:r>
               <w:rPr>
-                <w:rFonts w:ascii="Arial" w:hAnsi="Arial" w:eastAsia="Times"/>
+                <w:rFonts w:ascii="Times" w:hAnsi="Times" w:eastAsia="Times"/>
                 <w:b w:val="0"/>
                 <w:i w:val="0"/>
                 <w:color w:val="000000"/>
@@ -6188,7 +6182,7 @@
             </w:pPr>
             <w:r>
               <w:rPr>
-                <w:rFonts w:ascii="Arial" w:hAnsi="Arial" w:eastAsia="Times"/>
+                <w:rFonts w:ascii="Times" w:hAnsi="Times" w:eastAsia="Times"/>
                 <w:b w:val="0"/>
                 <w:i w:val="0"/>
                 <w:color w:val="000000"/>
@@ -6224,7 +6218,7 @@
             </w:pPr>
             <w:r>
               <w:rPr>
-                <w:rFonts w:ascii="Arial" w:hAnsi="Arial" w:eastAsia="Times"/>
+                <w:rFonts w:ascii="Times" w:hAnsi="Times" w:eastAsia="Times"/>
                 <w:b w:val="0"/>
                 <w:i w:val="0"/>
                 <w:color w:val="000000"/>
@@ -6260,7 +6254,7 @@
             </w:pPr>
             <w:r>
               <w:rPr>
-                <w:rFonts w:ascii="Arial" w:hAnsi="Arial" w:eastAsia="Times"/>
+                <w:rFonts w:ascii="Times" w:hAnsi="Times" w:eastAsia="Times"/>
                 <w:b w:val="0"/>
                 <w:i w:val="0"/>
                 <w:color w:val="000000"/>
@@ -6296,7 +6290,7 @@
             </w:pPr>
             <w:r>
               <w:rPr>
-                <w:rFonts w:ascii="Arial" w:hAnsi="Arial" w:eastAsia="Times"/>
+                <w:rFonts w:ascii="Times" w:hAnsi="Times" w:eastAsia="Times"/>
                 <w:b w:val="0"/>
                 <w:i w:val="0"/>
                 <w:color w:val="000000"/>
@@ -6337,7 +6331,7 @@
             </w:pPr>
             <w:r>
               <w:rPr>
-                <w:rFonts w:ascii="Arial" w:hAnsi="Arial" w:eastAsia="Times"/>
+                <w:rFonts w:ascii="Times" w:hAnsi="Times" w:eastAsia="Times"/>
                 <w:b w:val="0"/>
                 <w:i w:val="0"/>
                 <w:color w:val="000000"/>
@@ -6373,7 +6367,7 @@
             </w:pPr>
             <w:r>
               <w:rPr>
-                <w:rFonts w:ascii="Arial" w:hAnsi="Arial" w:eastAsia="Times"/>
+                <w:rFonts w:ascii="Times" w:hAnsi="Times" w:eastAsia="Times"/>
                 <w:b w:val="0"/>
                 <w:i w:val="0"/>
                 <w:color w:val="000000"/>
@@ -6409,7 +6403,7 @@
             </w:pPr>
             <w:r>
               <w:rPr>
-                <w:rFonts w:ascii="Arial" w:hAnsi="Arial" w:eastAsia="Times"/>
+                <w:rFonts w:ascii="Times" w:hAnsi="Times" w:eastAsia="Times"/>
                 <w:b w:val="0"/>
                 <w:i w:val="0"/>
                 <w:color w:val="000000"/>
@@ -6445,7 +6439,7 @@
             </w:pPr>
             <w:r>
               <w:rPr>
-                <w:rFonts w:ascii="Arial" w:hAnsi="Arial" w:eastAsia="Times"/>
+                <w:rFonts w:ascii="Times" w:hAnsi="Times" w:eastAsia="Times"/>
                 <w:b w:val="0"/>
                 <w:i w:val="0"/>
                 <w:color w:val="000000"/>
@@ -6481,7 +6475,7 @@
             </w:pPr>
             <w:r>
               <w:rPr>
-                <w:rFonts w:ascii="Arial" w:hAnsi="Arial" w:eastAsia="Times"/>
+                <w:rFonts w:ascii="Times" w:hAnsi="Times" w:eastAsia="Times"/>
                 <w:b w:val="0"/>
                 <w:i w:val="0"/>
                 <w:color w:val="000000"/>
@@ -6517,7 +6511,7 @@
             </w:pPr>
             <w:r>
               <w:rPr>
-                <w:rFonts w:ascii="Arial" w:hAnsi="Arial" w:eastAsia="Times"/>
+                <w:rFonts w:ascii="Times" w:hAnsi="Times" w:eastAsia="Times"/>
                 <w:b w:val="0"/>
                 <w:i w:val="0"/>
                 <w:color w:val="000000"/>
@@ -6558,7 +6552,7 @@
             </w:pPr>
             <w:r>
               <w:rPr>
-                <w:rFonts w:ascii="Arial" w:hAnsi="Arial" w:eastAsia="Times"/>
+                <w:rFonts w:ascii="Times" w:hAnsi="Times" w:eastAsia="Times"/>
                 <w:b w:val="0"/>
                 <w:i w:val="0"/>
                 <w:color w:val="000000"/>
@@ -6594,7 +6588,7 @@
             </w:pPr>
             <w:r>
               <w:rPr>
-                <w:rFonts w:ascii="Arial" w:hAnsi="Arial" w:eastAsia="Times"/>
+                <w:rFonts w:ascii="Times" w:hAnsi="Times" w:eastAsia="Times"/>
                 <w:b w:val="0"/>
                 <w:i w:val="0"/>
                 <w:color w:val="000000"/>
@@ -6630,7 +6624,7 @@
             </w:pPr>
             <w:r>
               <w:rPr>
-                <w:rFonts w:ascii="Arial" w:hAnsi="Arial" w:eastAsia="Times"/>
+                <w:rFonts w:ascii="Times" w:hAnsi="Times" w:eastAsia="Times"/>
                 <w:b w:val="0"/>
                 <w:i w:val="0"/>
                 <w:color w:val="000000"/>
@@ -6666,7 +6660,7 @@
             </w:pPr>
             <w:r>
               <w:rPr>
-                <w:rFonts w:ascii="Arial" w:hAnsi="Arial" w:eastAsia="Times"/>
+                <w:rFonts w:ascii="Times" w:hAnsi="Times" w:eastAsia="Times"/>
                 <w:b w:val="0"/>
                 <w:i w:val="0"/>
                 <w:color w:val="000000"/>
@@ -6702,7 +6696,7 @@
             </w:pPr>
             <w:r>
               <w:rPr>
-                <w:rFonts w:ascii="Arial" w:hAnsi="Arial" w:eastAsia="Times"/>
+                <w:rFonts w:ascii="Times" w:hAnsi="Times" w:eastAsia="Times"/>
                 <w:b w:val="0"/>
                 <w:i w:val="0"/>
                 <w:color w:val="000000"/>
@@ -6738,7 +6732,7 @@
             </w:pPr>
             <w:r>
               <w:rPr>
-                <w:rFonts w:ascii="Arial" w:hAnsi="Arial" w:eastAsia="Times"/>
+                <w:rFonts w:ascii="Times" w:hAnsi="Times" w:eastAsia="Times"/>
                 <w:b w:val="0"/>
                 <w:i w:val="0"/>
                 <w:color w:val="000000"/>
@@ -6779,7 +6773,7 @@
             </w:pPr>
             <w:r>
               <w:rPr>
-                <w:rFonts w:ascii="Arial" w:hAnsi="Arial" w:eastAsia="Times"/>
+                <w:rFonts w:ascii="Times" w:hAnsi="Times" w:eastAsia="Times"/>
                 <w:b w:val="0"/>
                 <w:i w:val="0"/>
                 <w:color w:val="000000"/>
@@ -6815,7 +6809,7 @@
             </w:pPr>
             <w:r>
               <w:rPr>
-                <w:rFonts w:ascii="Arial" w:hAnsi="Arial" w:eastAsia="Times"/>
+                <w:rFonts w:ascii="Times" w:hAnsi="Times" w:eastAsia="Times"/>
                 <w:b w:val="0"/>
                 <w:i w:val="0"/>
                 <w:color w:val="000000"/>
@@ -6851,7 +6845,7 @@
             </w:pPr>
             <w:r>
               <w:rPr>
-                <w:rFonts w:ascii="Arial" w:hAnsi="Arial" w:eastAsia="Times"/>
+                <w:rFonts w:ascii="Times" w:hAnsi="Times" w:eastAsia="Times"/>
                 <w:b w:val="0"/>
                 <w:i w:val="0"/>
                 <w:color w:val="000000"/>
@@ -6887,7 +6881,7 @@
             </w:pPr>
             <w:r>
               <w:rPr>
-                <w:rFonts w:ascii="Arial" w:hAnsi="Arial" w:eastAsia="Times"/>
+                <w:rFonts w:ascii="Times" w:hAnsi="Times" w:eastAsia="Times"/>
                 <w:b w:val="0"/>
                 <w:i w:val="0"/>
                 <w:color w:val="000000"/>
@@ -6923,7 +6917,7 @@
             </w:pPr>
             <w:r>
               <w:rPr>
-                <w:rFonts w:ascii="Arial" w:hAnsi="Arial" w:eastAsia="Times"/>
+                <w:rFonts w:ascii="Times" w:hAnsi="Times" w:eastAsia="Times"/>
                 <w:b w:val="0"/>
                 <w:i w:val="0"/>
                 <w:color w:val="000000"/>
@@ -6959,7 +6953,7 @@
             </w:pPr>
             <w:r>
               <w:rPr>
-                <w:rFonts w:ascii="Arial" w:hAnsi="Arial" w:eastAsia="Times"/>
+                <w:rFonts w:ascii="Times" w:hAnsi="Times" w:eastAsia="Times"/>
                 <w:b w:val="0"/>
                 <w:i w:val="0"/>
                 <w:color w:val="000000"/>
@@ -7000,7 +6994,7 @@
             </w:pPr>
             <w:r>
               <w:rPr>
-                <w:rFonts w:ascii="Arial" w:hAnsi="Arial" w:eastAsia="Times"/>
+                <w:rFonts w:ascii="Times" w:hAnsi="Times" w:eastAsia="Times"/>
                 <w:b w:val="0"/>
                 <w:i w:val="0"/>
                 <w:color w:val="000000"/>
@@ -7036,7 +7030,7 @@
             </w:pPr>
             <w:r>
               <w:rPr>
-                <w:rFonts w:ascii="Arial" w:hAnsi="Arial" w:eastAsia="Times"/>
+                <w:rFonts w:ascii="Times" w:hAnsi="Times" w:eastAsia="Times"/>
                 <w:b w:val="0"/>
                 <w:i w:val="0"/>
                 <w:color w:val="000000"/>
@@ -7072,7 +7066,7 @@
             </w:pPr>
             <w:r>
               <w:rPr>
-                <w:rFonts w:ascii="Arial" w:hAnsi="Arial" w:eastAsia="Times"/>
+                <w:rFonts w:ascii="Times" w:hAnsi="Times" w:eastAsia="Times"/>
                 <w:b w:val="0"/>
                 <w:i w:val="0"/>
                 <w:color w:val="000000"/>
@@ -7108,7 +7102,7 @@
             </w:pPr>
             <w:r>
               <w:rPr>
-                <w:rFonts w:ascii="Arial" w:hAnsi="Arial" w:eastAsia="Times"/>
+                <w:rFonts w:ascii="Times" w:hAnsi="Times" w:eastAsia="Times"/>
                 <w:b w:val="0"/>
                 <w:i w:val="0"/>
                 <w:color w:val="000000"/>
@@ -7144,7 +7138,7 @@
             </w:pPr>
             <w:r>
               <w:rPr>
-                <w:rFonts w:ascii="Arial" w:hAnsi="Arial" w:eastAsia="Times"/>
+                <w:rFonts w:ascii="Times" w:hAnsi="Times" w:eastAsia="Times"/>
                 <w:b w:val="0"/>
                 <w:i w:val="0"/>
                 <w:color w:val="000000"/>
@@ -7180,7 +7174,7 @@
             </w:pPr>
             <w:r>
               <w:rPr>
-                <w:rFonts w:ascii="Arial" w:hAnsi="Arial" w:eastAsia="Times"/>
+                <w:rFonts w:ascii="Times" w:hAnsi="Times" w:eastAsia="Times"/>
                 <w:b w:val="0"/>
                 <w:i w:val="0"/>
                 <w:color w:val="000000"/>
@@ -7535,7 +7529,7 @@
             </w:pPr>
             <w:r>
               <w:rPr>
-                <w:rFonts w:ascii="Arial" w:hAnsi="Arial" w:eastAsia="Symbol"/>
+                <w:rFonts w:ascii="Symbol" w:hAnsi="Symbol" w:eastAsia="Symbol"/>
                 <w:b w:val="0"/>
                 <w:i w:val="0"/>
                 <w:color w:val="000000"/>
@@ -7571,7 +7565,7 @@
             </w:pPr>
             <w:r>
               <w:rPr>
-                <w:rFonts w:ascii="Arial" w:hAnsi="Arial" w:eastAsia="Times"/>
+                <w:rFonts w:ascii="Times" w:hAnsi="Times" w:eastAsia="Times"/>
                 <w:b/>
                 <w:i w:val="0"/>
                 <w:color w:val="000000"/>
@@ -7607,7 +7601,7 @@
             </w:pPr>
             <w:r>
               <w:rPr>
-                <w:rFonts w:ascii="Arial" w:hAnsi="Arial" w:eastAsia="Times"/>
+                <w:rFonts w:ascii="Times" w:hAnsi="Times" w:eastAsia="Times"/>
                 <w:b/>
                 <w:i w:val="0"/>
                 <w:color w:val="000000"/>
@@ -7643,7 +7637,7 @@
             </w:pPr>
             <w:r>
               <w:rPr>
-                <w:rFonts w:ascii="Arial" w:hAnsi="Arial" w:eastAsia="Times"/>
+                <w:rFonts w:ascii="Times" w:hAnsi="Times" w:eastAsia="Times"/>
                 <w:b/>
                 <w:i w:val="0"/>
                 <w:color w:val="000000"/>
@@ -7684,7 +7678,7 @@
             </w:pPr>
             <w:r>
               <w:rPr>
-                <w:rFonts w:ascii="Arial" w:hAnsi="Arial" w:eastAsia="Symbol"/>
+                <w:rFonts w:ascii="Symbol" w:hAnsi="Symbol" w:eastAsia="Symbol"/>
                 <w:b w:val="0"/>
                 <w:i w:val="0"/>
                 <w:color w:val="000000"/>
@@ -7694,7 +7688,7 @@
             </w:r>
             <w:r>
               <w:rPr>
-                <w:rFonts w:ascii="Arial" w:hAnsi="Arial" w:eastAsia="Times"/>
+                <w:rFonts w:ascii="Times" w:hAnsi="Times" w:eastAsia="Times"/>
                 <w:b w:val="0"/>
                 <w:i w:val="0"/>
                 <w:color w:val="000000"/>
@@ -7730,7 +7724,7 @@
             </w:pPr>
             <w:r>
               <w:rPr>
-                <w:rFonts w:ascii="Arial" w:hAnsi="Arial" w:eastAsia="Times"/>
+                <w:rFonts w:ascii="Times" w:hAnsi="Times" w:eastAsia="Times"/>
                 <w:b w:val="0"/>
                 <w:i w:val="0"/>
                 <w:color w:val="000000"/>
@@ -7766,7 +7760,7 @@
             </w:pPr>
             <w:r>
               <w:rPr>
-                <w:rFonts w:ascii="Arial" w:hAnsi="Arial" w:eastAsia="Times"/>
+                <w:rFonts w:ascii="Times" w:hAnsi="Times" w:eastAsia="Times"/>
                 <w:b w:val="0"/>
                 <w:i w:val="0"/>
                 <w:color w:val="000000"/>
@@ -7802,7 +7796,7 @@
             </w:pPr>
             <w:r>
               <w:rPr>
-                <w:rFonts w:ascii="Arial" w:hAnsi="Arial" w:eastAsia="Symbol"/>
+                <w:rFonts w:ascii="Symbol" w:hAnsi="Symbol" w:eastAsia="Symbol"/>
                 <w:b w:val="0"/>
                 <w:i w:val="0"/>
                 <w:color w:val="000000"/>
@@ -7812,7 +7806,7 @@
             </w:r>
             <w:r>
               <w:rPr>
-                <w:rFonts w:ascii="Arial" w:hAnsi="Arial" w:eastAsia="Times"/>
+                <w:rFonts w:ascii="Times" w:hAnsi="Times" w:eastAsia="Times"/>
                 <w:b w:val="0"/>
                 <w:i w:val="0"/>
                 <w:color w:val="000000"/>
@@ -7853,7 +7847,7 @@
             </w:pPr>
             <w:r>
               <w:rPr>
-                <w:rFonts w:ascii="Arial" w:hAnsi="Arial" w:eastAsia="Times"/>
+                <w:rFonts w:ascii="Times" w:hAnsi="Times" w:eastAsia="Times"/>
                 <w:b w:val="0"/>
                 <w:i w:val="0"/>
                 <w:color w:val="000000"/>
@@ -7889,7 +7883,7 @@
             </w:pPr>
             <w:r>
               <w:rPr>
-                <w:rFonts w:ascii="Arial" w:hAnsi="Arial" w:eastAsia="Times"/>
+                <w:rFonts w:ascii="Times" w:hAnsi="Times" w:eastAsia="Times"/>
                 <w:b w:val="0"/>
                 <w:i w:val="0"/>
                 <w:color w:val="000000"/>
@@ -7925,7 +7919,7 @@
             </w:pPr>
             <w:r>
               <w:rPr>
-                <w:rFonts w:ascii="Arial" w:hAnsi="Arial" w:eastAsia="Times"/>
+                <w:rFonts w:ascii="Times" w:hAnsi="Times" w:eastAsia="Times"/>
                 <w:b w:val="0"/>
                 <w:i w:val="0"/>
                 <w:color w:val="000000"/>
@@ -7961,7 +7955,7 @@
             </w:pPr>
             <w:r>
               <w:rPr>
-                <w:rFonts w:ascii="Arial" w:hAnsi="Arial" w:eastAsia="Symbol"/>
+                <w:rFonts w:ascii="Symbol" w:hAnsi="Symbol" w:eastAsia="Symbol"/>
                 <w:b w:val="0"/>
                 <w:i w:val="0"/>
                 <w:color w:val="000000"/>
@@ -7971,7 +7965,7 @@
             </w:r>
             <w:r>
               <w:rPr>
-                <w:rFonts w:ascii="Arial" w:hAnsi="Arial" w:eastAsia="Times"/>
+                <w:rFonts w:ascii="Times" w:hAnsi="Times" w:eastAsia="Times"/>
                 <w:b w:val="0"/>
                 <w:i w:val="0"/>
                 <w:color w:val="000000"/>
@@ -8012,7 +8006,7 @@
             </w:pPr>
             <w:r>
               <w:rPr>
-                <w:rFonts w:ascii="Arial" w:hAnsi="Arial" w:eastAsia="Times"/>
+                <w:rFonts w:ascii="Times" w:hAnsi="Times" w:eastAsia="Times"/>
                 <w:b w:val="0"/>
                 <w:i w:val="0"/>
                 <w:color w:val="000000"/>
@@ -8048,7 +8042,7 @@
             </w:pPr>
             <w:r>
               <w:rPr>
-                <w:rFonts w:ascii="Arial" w:hAnsi="Arial" w:eastAsia="Times"/>
+                <w:rFonts w:ascii="Times" w:hAnsi="Times" w:eastAsia="Times"/>
                 <w:b w:val="0"/>
                 <w:i w:val="0"/>
                 <w:color w:val="000000"/>
@@ -8084,7 +8078,7 @@
             </w:pPr>
             <w:r>
               <w:rPr>
-                <w:rFonts w:ascii="Arial" w:hAnsi="Arial" w:eastAsia="Times"/>
+                <w:rFonts w:ascii="Times" w:hAnsi="Times" w:eastAsia="Times"/>
                 <w:b w:val="0"/>
                 <w:i w:val="0"/>
                 <w:color w:val="000000"/>
@@ -8120,7 +8114,7 @@
             </w:pPr>
             <w:r>
               <w:rPr>
-                <w:rFonts w:ascii="Arial" w:hAnsi="Arial" w:eastAsia="Symbol"/>
+                <w:rFonts w:ascii="Symbol" w:hAnsi="Symbol" w:eastAsia="Symbol"/>
                 <w:b w:val="0"/>
                 <w:i w:val="0"/>
                 <w:color w:val="000000"/>
@@ -8130,7 +8124,7 @@
             </w:r>
             <w:r>
               <w:rPr>
-                <w:rFonts w:ascii="Arial" w:hAnsi="Arial" w:eastAsia="Times"/>
+                <w:rFonts w:ascii="Times" w:hAnsi="Times" w:eastAsia="Times"/>
                 <w:b w:val="0"/>
                 <w:i w:val="0"/>
                 <w:color w:val="000000"/>
@@ -8171,7 +8165,7 @@
             </w:pPr>
             <w:r>
               <w:rPr>
-                <w:rFonts w:ascii="Arial" w:hAnsi="Arial" w:eastAsia="Times"/>
+                <w:rFonts w:ascii="Times" w:hAnsi="Times" w:eastAsia="Times"/>
                 <w:b w:val="0"/>
                 <w:i w:val="0"/>
                 <w:color w:val="000000"/>
@@ -8207,7 +8201,7 @@
             </w:pPr>
             <w:r>
               <w:rPr>
-                <w:rFonts w:ascii="Arial" w:hAnsi="Arial" w:eastAsia="Times"/>
+                <w:rFonts w:ascii="Times" w:hAnsi="Times" w:eastAsia="Times"/>
                 <w:b w:val="0"/>
                 <w:i w:val="0"/>
                 <w:color w:val="000000"/>
@@ -8243,7 +8237,7 @@
             </w:pPr>
             <w:r>
               <w:rPr>
-                <w:rFonts w:ascii="Arial" w:hAnsi="Arial" w:eastAsia="Times"/>
+                <w:rFonts w:ascii="Times" w:hAnsi="Times" w:eastAsia="Times"/>
                 <w:b w:val="0"/>
                 <w:i w:val="0"/>
                 <w:color w:val="000000"/>
@@ -8279,7 +8273,7 @@
             </w:pPr>
             <w:r>
               <w:rPr>
-                <w:rFonts w:ascii="Arial" w:hAnsi="Arial" w:eastAsia="Symbol"/>
+                <w:rFonts w:ascii="Symbol" w:hAnsi="Symbol" w:eastAsia="Symbol"/>
                 <w:b w:val="0"/>
                 <w:i w:val="0"/>
                 <w:color w:val="000000"/>
@@ -8289,7 +8283,7 @@
             </w:r>
             <w:r>
               <w:rPr>
-                <w:rFonts w:ascii="Arial" w:hAnsi="Arial" w:eastAsia="Times"/>
+                <w:rFonts w:ascii="Times" w:hAnsi="Times" w:eastAsia="Times"/>
                 <w:b w:val="0"/>
                 <w:i w:val="0"/>
                 <w:color w:val="000000"/>
@@ -8330,7 +8324,7 @@
             </w:pPr>
             <w:r>
               <w:rPr>
-                <w:rFonts w:ascii="Arial" w:hAnsi="Arial" w:eastAsia="Times"/>
+                <w:rFonts w:ascii="Times" w:hAnsi="Times" w:eastAsia="Times"/>
                 <w:b w:val="0"/>
                 <w:i w:val="0"/>
                 <w:color w:val="000000"/>
@@ -8366,7 +8360,7 @@
             </w:pPr>
             <w:r>
               <w:rPr>
-                <w:rFonts w:ascii="Arial" w:hAnsi="Arial" w:eastAsia="Times"/>
+                <w:rFonts w:ascii="Times" w:hAnsi="Times" w:eastAsia="Times"/>
                 <w:b w:val="0"/>
                 <w:i w:val="0"/>
                 <w:color w:val="000000"/>
@@ -8402,7 +8396,7 @@
             </w:pPr>
             <w:r>
               <w:rPr>
-                <w:rFonts w:ascii="Arial" w:hAnsi="Arial" w:eastAsia="Times"/>
+                <w:rFonts w:ascii="Times" w:hAnsi="Times" w:eastAsia="Times"/>
                 <w:b w:val="0"/>
                 <w:i w:val="0"/>
                 <w:color w:val="000000"/>
@@ -8438,7 +8432,7 @@
             </w:pPr>
             <w:r>
               <w:rPr>
-                <w:rFonts w:ascii="Arial" w:hAnsi="Arial" w:eastAsia="Symbol"/>
+                <w:rFonts w:ascii="Symbol" w:hAnsi="Symbol" w:eastAsia="Symbol"/>
                 <w:b w:val="0"/>
                 <w:i w:val="0"/>
                 <w:color w:val="000000"/>
@@ -8448,7 +8442,7 @@
             </w:r>
             <w:r>
               <w:rPr>
-                <w:rFonts w:ascii="Arial" w:hAnsi="Arial" w:eastAsia="Times"/>
+                <w:rFonts w:ascii="Times" w:hAnsi="Times" w:eastAsia="Times"/>
                 <w:b w:val="0"/>
                 <w:i w:val="0"/>
                 <w:color w:val="000000"/>
@@ -9061,7 +9055,7 @@
             </w:pPr>
             <w:r>
               <w:rPr>
-                <w:rFonts w:ascii="Arial" w:hAnsi="Arial" w:eastAsia="Symbol"/>
+                <w:rFonts w:ascii="Symbol" w:hAnsi="Symbol" w:eastAsia="Symbol"/>
                 <w:b w:val="0"/>
                 <w:i w:val="0"/>
                 <w:color w:val="000000"/>
@@ -9097,7 +9091,7 @@
             </w:pPr>
             <w:r>
               <w:rPr>
-                <w:rFonts w:ascii="Arial" w:hAnsi="Arial" w:eastAsia="Times"/>
+                <w:rFonts w:ascii="Times" w:hAnsi="Times" w:eastAsia="Times"/>
                 <w:b/>
                 <w:i w:val="0"/>
                 <w:color w:val="000000"/>
@@ -9133,7 +9127,7 @@
             </w:pPr>
             <w:r>
               <w:rPr>
-                <w:rFonts w:ascii="Arial" w:hAnsi="Arial" w:eastAsia="Times"/>
+                <w:rFonts w:ascii="Times" w:hAnsi="Times" w:eastAsia="Times"/>
                 <w:b/>
                 <w:i w:val="0"/>
                 <w:color w:val="000000"/>
@@ -9169,7 +9163,7 @@
             </w:pPr>
             <w:r>
               <w:rPr>
-                <w:rFonts w:ascii="Arial" w:hAnsi="Arial" w:eastAsia="Times"/>
+                <w:rFonts w:ascii="Times" w:hAnsi="Times" w:eastAsia="Times"/>
                 <w:b/>
                 <w:i w:val="0"/>
                 <w:color w:val="000000"/>
@@ -9205,7 +9199,7 @@
             </w:pPr>
             <w:r>
               <w:rPr>
-                <w:rFonts w:ascii="Arial" w:hAnsi="Arial" w:eastAsia="Times"/>
+                <w:rFonts w:ascii="Times" w:hAnsi="Times" w:eastAsia="Times"/>
                 <w:b/>
                 <w:i w:val="0"/>
                 <w:color w:val="000000"/>
@@ -9241,7 +9235,7 @@
             </w:pPr>
             <w:r>
               <w:rPr>
-                <w:rFonts w:ascii="Arial" w:hAnsi="Arial" w:eastAsia="Times"/>
+                <w:rFonts w:ascii="Times" w:hAnsi="Times" w:eastAsia="Times"/>
                 <w:b/>
                 <w:i w:val="0"/>
                 <w:color w:val="000000"/>
@@ -9282,7 +9276,7 @@
             </w:pPr>
             <w:r>
               <w:rPr>
-                <w:rFonts w:ascii="Arial" w:hAnsi="Arial" w:eastAsia="Times"/>
+                <w:rFonts w:ascii="Times" w:hAnsi="Times" w:eastAsia="Times"/>
                 <w:b w:val="0"/>
                 <w:i w:val="0"/>
                 <w:color w:val="000000"/>
@@ -9318,7 +9312,7 @@
             </w:pPr>
             <w:r>
               <w:rPr>
-                <w:rFonts w:ascii="Arial" w:hAnsi="Arial" w:eastAsia="Times"/>
+                <w:rFonts w:ascii="Times" w:hAnsi="Times" w:eastAsia="Times"/>
                 <w:b w:val="0"/>
                 <w:i w:val="0"/>
                 <w:color w:val="000000"/>
@@ -9354,7 +9348,7 @@
             </w:pPr>
             <w:r>
               <w:rPr>
-                <w:rFonts w:ascii="Arial" w:hAnsi="Arial" w:eastAsia="Times"/>
+                <w:rFonts w:ascii="Times" w:hAnsi="Times" w:eastAsia="Times"/>
                 <w:b w:val="0"/>
                 <w:i w:val="0"/>
                 <w:color w:val="000000"/>
@@ -9390,7 +9384,7 @@
             </w:pPr>
             <w:r>
               <w:rPr>
-                <w:rFonts w:ascii="Arial" w:hAnsi="Arial" w:eastAsia="Times"/>
+                <w:rFonts w:ascii="Times" w:hAnsi="Times" w:eastAsia="Times"/>
                 <w:b w:val="0"/>
                 <w:i w:val="0"/>
                 <w:color w:val="000000"/>
@@ -9426,7 +9420,7 @@
             </w:pPr>
             <w:r>
               <w:rPr>
-                <w:rFonts w:ascii="Arial" w:hAnsi="Arial" w:eastAsia="Times"/>
+                <w:rFonts w:ascii="Times" w:hAnsi="Times" w:eastAsia="Times"/>
                 <w:b w:val="0"/>
                 <w:i w:val="0"/>
                 <w:color w:val="000000"/>
@@ -9462,7 +9456,7 @@
             </w:pPr>
             <w:r>
               <w:rPr>
-                <w:rFonts w:ascii="Arial" w:hAnsi="Arial" w:eastAsia="Times"/>
+                <w:rFonts w:ascii="Times" w:hAnsi="Times" w:eastAsia="Times"/>
                 <w:b w:val="0"/>
                 <w:i w:val="0"/>
                 <w:color w:val="000000"/>
@@ -9503,7 +9497,7 @@
             </w:pPr>
             <w:r>
               <w:rPr>
-                <w:rFonts w:ascii="Arial" w:hAnsi="Arial" w:eastAsia="Times"/>
+                <w:rFonts w:ascii="Times" w:hAnsi="Times" w:eastAsia="Times"/>
                 <w:b w:val="0"/>
                 <w:i w:val="0"/>
                 <w:color w:val="000000"/>
@@ -9539,7 +9533,7 @@
             </w:pPr>
             <w:r>
               <w:rPr>
-                <w:rFonts w:ascii="Arial" w:hAnsi="Arial" w:eastAsia="Times"/>
+                <w:rFonts w:ascii="Times" w:hAnsi="Times" w:eastAsia="Times"/>
                 <w:b w:val="0"/>
                 <w:i w:val="0"/>
                 <w:color w:val="000000"/>
@@ -9549,7 +9543,7 @@
             </w:r>
             <w:r>
               <w:rPr>
-                <w:rFonts w:ascii="Arial" w:hAnsi="Arial" w:eastAsia="Times"/>
+                <w:rFonts w:ascii="Times" w:hAnsi="Times" w:eastAsia="Times"/>
                 <w:b w:val="0"/>
                 <w:i w:val="0"/>
                 <w:color w:val="000000"/>
@@ -9585,7 +9579,7 @@
             </w:pPr>
             <w:r>
               <w:rPr>
-                <w:rFonts w:ascii="Arial" w:hAnsi="Arial" w:eastAsia="Times"/>
+                <w:rFonts w:ascii="Times" w:hAnsi="Times" w:eastAsia="Times"/>
                 <w:b w:val="0"/>
                 <w:i w:val="0"/>
                 <w:color w:val="000000"/>
@@ -9621,7 +9615,7 @@
             </w:pPr>
             <w:r>
               <w:rPr>
-                <w:rFonts w:ascii="Arial" w:hAnsi="Arial" w:eastAsia="Times"/>
+                <w:rFonts w:ascii="Times" w:hAnsi="Times" w:eastAsia="Times"/>
                 <w:b w:val="0"/>
                 <w:i w:val="0"/>
                 <w:color w:val="000000"/>
@@ -9657,7 +9651,7 @@
             </w:pPr>
             <w:r>
               <w:rPr>
-                <w:rFonts w:ascii="Arial" w:hAnsi="Arial" w:eastAsia="Times"/>
+                <w:rFonts w:ascii="Times" w:hAnsi="Times" w:eastAsia="Times"/>
                 <w:b w:val="0"/>
                 <w:i w:val="0"/>
                 <w:color w:val="000000"/>
@@ -9693,7 +9687,7 @@
             </w:pPr>
             <w:r>
               <w:rPr>
-                <w:rFonts w:ascii="Arial" w:hAnsi="Arial" w:eastAsia="Times"/>
+                <w:rFonts w:ascii="Times" w:hAnsi="Times" w:eastAsia="Times"/>
                 <w:b w:val="0"/>
                 <w:i w:val="0"/>
                 <w:color w:val="000000"/>
@@ -9734,7 +9728,7 @@
             </w:pPr>
             <w:r>
               <w:rPr>
-                <w:rFonts w:ascii="Arial" w:hAnsi="Arial" w:eastAsia="Times"/>
+                <w:rFonts w:ascii="Times" w:hAnsi="Times" w:eastAsia="Times"/>
                 <w:b w:val="0"/>
                 <w:i w:val="0"/>
                 <w:color w:val="000000"/>
@@ -9770,7 +9764,7 @@
             </w:pPr>
             <w:r>
               <w:rPr>
-                <w:rFonts w:ascii="Arial" w:hAnsi="Arial" w:eastAsia="Times"/>
+                <w:rFonts w:ascii="Times" w:hAnsi="Times" w:eastAsia="Times"/>
                 <w:b w:val="0"/>
                 <w:i w:val="0"/>
                 <w:color w:val="000000"/>
@@ -9806,7 +9800,7 @@
             </w:pPr>
             <w:r>
               <w:rPr>
-                <w:rFonts w:ascii="Arial" w:hAnsi="Arial" w:eastAsia="Times"/>
+                <w:rFonts w:ascii="Times" w:hAnsi="Times" w:eastAsia="Times"/>
                 <w:b w:val="0"/>
                 <w:i w:val="0"/>
                 <w:color w:val="000000"/>
@@ -9842,7 +9836,7 @@
             </w:pPr>
             <w:r>
               <w:rPr>
-                <w:rFonts w:ascii="Arial" w:hAnsi="Arial" w:eastAsia="Times"/>
+                <w:rFonts w:ascii="Times" w:hAnsi="Times" w:eastAsia="Times"/>
                 <w:b w:val="0"/>
                 <w:i w:val="0"/>
                 <w:color w:val="000000"/>
@@ -9878,7 +9872,7 @@
             </w:pPr>
             <w:r>
               <w:rPr>
-                <w:rFonts w:ascii="Arial" w:hAnsi="Arial" w:eastAsia="Times"/>
+                <w:rFonts w:ascii="Times" w:hAnsi="Times" w:eastAsia="Times"/>
                 <w:b w:val="0"/>
                 <w:i w:val="0"/>
                 <w:color w:val="000000"/>
@@ -9914,7 +9908,7 @@
             </w:pPr>
             <w:r>
               <w:rPr>
-                <w:rFonts w:ascii="Arial" w:hAnsi="Arial" w:eastAsia="Times"/>
+                <w:rFonts w:ascii="Times" w:hAnsi="Times" w:eastAsia="Times"/>
                 <w:b w:val="0"/>
                 <w:i w:val="0"/>
                 <w:color w:val="000000"/>
@@ -11243,7 +11237,7 @@
             </w:pPr>
             <w:r>
               <w:rPr>
-                <w:rFonts w:ascii="Arial" w:hAnsi="Arial" w:eastAsia="Times"/>
+                <w:rFonts w:ascii="Times" w:hAnsi="Times" w:eastAsia="Times"/>
                 <w:b/>
                 <w:i w:val="0"/>
                 <w:color w:val="000000"/>
@@ -11279,7 +11273,7 @@
             </w:pPr>
             <w:r>
               <w:rPr>
-                <w:rFonts w:ascii="Arial" w:hAnsi="Arial" w:eastAsia="Times"/>
+                <w:rFonts w:ascii="Times" w:hAnsi="Times" w:eastAsia="Times"/>
                 <w:b/>
                 <w:i w:val="0"/>
                 <w:color w:val="000000"/>
@@ -11315,7 +11309,7 @@
             </w:pPr>
             <w:r>
               <w:rPr>
-                <w:rFonts w:ascii="Arial" w:hAnsi="Arial" w:eastAsia="Times"/>
+                <w:rFonts w:ascii="Times" w:hAnsi="Times" w:eastAsia="Times"/>
                 <w:b/>
                 <w:i w:val="0"/>
                 <w:color w:val="000000"/>
@@ -11325,7 +11319,7 @@
             </w:r>
             <w:r>
               <w:rPr>
-                <w:rFonts w:ascii="Arial" w:hAnsi="Arial" w:eastAsia="Times"/>
+                <w:rFonts w:ascii="Times" w:hAnsi="Times" w:eastAsia="Times"/>
                 <w:b/>
                 <w:i w:val="0"/>
                 <w:color w:val="000000"/>
@@ -11361,7 +11355,7 @@
             </w:pPr>
             <w:r>
               <w:rPr>
-                <w:rFonts w:ascii="Arial" w:hAnsi="Arial" w:eastAsia="Times"/>
+                <w:rFonts w:ascii="Times" w:hAnsi="Times" w:eastAsia="Times"/>
                 <w:b/>
                 <w:i w:val="0"/>
                 <w:color w:val="000000"/>
@@ -11397,7 +11391,7 @@
             </w:pPr>
             <w:r>
               <w:rPr>
-                <w:rFonts w:ascii="Arial" w:hAnsi="Arial" w:eastAsia="Times"/>
+                <w:rFonts w:ascii="Times" w:hAnsi="Times" w:eastAsia="Times"/>
                 <w:b/>
                 <w:i w:val="0"/>
                 <w:color w:val="000000"/>
@@ -11438,7 +11432,7 @@
             </w:pPr>
             <w:r>
               <w:rPr>
-                <w:rFonts w:ascii="Arial" w:hAnsi="Arial" w:eastAsia="Times"/>
+                <w:rFonts w:ascii="Times" w:hAnsi="Times" w:eastAsia="Times"/>
                 <w:b w:val="0"/>
                 <w:i w:val="0"/>
                 <w:color w:val="000000"/>
@@ -11474,7 +11468,7 @@
             </w:pPr>
             <w:r>
               <w:rPr>
-                <w:rFonts w:ascii="Arial" w:hAnsi="Arial" w:eastAsia="Times"/>
+                <w:rFonts w:ascii="Times" w:hAnsi="Times" w:eastAsia="Times"/>
                 <w:b w:val="0"/>
                 <w:i w:val="0"/>
                 <w:color w:val="000000"/>
@@ -11510,7 +11504,7 @@
             </w:pPr>
             <w:r>
               <w:rPr>
-                <w:rFonts w:ascii="Arial" w:hAnsi="Arial" w:eastAsia="Times"/>
+                <w:rFonts w:ascii="Times" w:hAnsi="Times" w:eastAsia="Times"/>
                 <w:b w:val="0"/>
                 <w:i w:val="0"/>
                 <w:color w:val="000000"/>
@@ -11546,7 +11540,7 @@
             </w:pPr>
             <w:r>
               <w:rPr>
-                <w:rFonts w:ascii="Arial" w:hAnsi="Arial" w:eastAsia="Times"/>
+                <w:rFonts w:ascii="Times" w:hAnsi="Times" w:eastAsia="Times"/>
                 <w:b w:val="0"/>
                 <w:i w:val="0"/>
                 <w:color w:val="000000"/>
@@ -11582,7 +11576,7 @@
             </w:pPr>
             <w:r>
               <w:rPr>
-                <w:rFonts w:ascii="Arial" w:hAnsi="Arial" w:eastAsia="Times"/>
+                <w:rFonts w:ascii="Times" w:hAnsi="Times" w:eastAsia="Times"/>
                 <w:b w:val="0"/>
                 <w:i w:val="0"/>
                 <w:color w:val="000000"/>
@@ -11623,7 +11617,7 @@
             </w:pPr>
             <w:r>
               <w:rPr>
-                <w:rFonts w:ascii="Arial" w:hAnsi="Arial" w:eastAsia="Times"/>
+                <w:rFonts w:ascii="Times" w:hAnsi="Times" w:eastAsia="Times"/>
                 <w:b w:val="0"/>
                 <w:i w:val="0"/>
                 <w:color w:val="000000"/>
@@ -11659,7 +11653,7 @@
             </w:pPr>
             <w:r>
               <w:rPr>
-                <w:rFonts w:ascii="Arial" w:hAnsi="Arial" w:eastAsia="Times"/>
+                <w:rFonts w:ascii="Times" w:hAnsi="Times" w:eastAsia="Times"/>
                 <w:b w:val="0"/>
                 <w:i w:val="0"/>
                 <w:color w:val="000000"/>
@@ -11695,7 +11689,7 @@
             </w:pPr>
             <w:r>
               <w:rPr>
-                <w:rFonts w:ascii="Arial" w:hAnsi="Arial" w:eastAsia="Times"/>
+                <w:rFonts w:ascii="Times" w:hAnsi="Times" w:eastAsia="Times"/>
                 <w:b w:val="0"/>
                 <w:i w:val="0"/>
                 <w:color w:val="000000"/>
@@ -11731,7 +11725,7 @@
             </w:pPr>
             <w:r>
               <w:rPr>
-                <w:rFonts w:ascii="Arial" w:hAnsi="Arial" w:eastAsia="Times"/>
+                <w:rFonts w:ascii="Times" w:hAnsi="Times" w:eastAsia="Times"/>
                 <w:b w:val="0"/>
                 <w:i w:val="0"/>
                 <w:color w:val="000000"/>
@@ -11767,7 +11761,7 @@
             </w:pPr>
             <w:r>
               <w:rPr>
-                <w:rFonts w:ascii="Arial" w:hAnsi="Arial" w:eastAsia="Times"/>
+                <w:rFonts w:ascii="Times" w:hAnsi="Times" w:eastAsia="Times"/>
                 <w:b w:val="0"/>
                 <w:i w:val="0"/>
                 <w:color w:val="000000"/>
@@ -11808,7 +11802,7 @@
             </w:pPr>
             <w:r>
               <w:rPr>
-                <w:rFonts w:ascii="Arial" w:hAnsi="Arial" w:eastAsia="Times"/>
+                <w:rFonts w:ascii="Times" w:hAnsi="Times" w:eastAsia="Times"/>
                 <w:b w:val="0"/>
                 <w:i w:val="0"/>
                 <w:color w:val="000000"/>
@@ -11844,7 +11838,7 @@
             </w:pPr>
             <w:r>
               <w:rPr>
-                <w:rFonts w:ascii="Arial" w:hAnsi="Arial" w:eastAsia="Times"/>
+                <w:rFonts w:ascii="Times" w:hAnsi="Times" w:eastAsia="Times"/>
                 <w:b w:val="0"/>
                 <w:i w:val="0"/>
                 <w:color w:val="000000"/>
@@ -11880,7 +11874,7 @@
             </w:pPr>
             <w:r>
               <w:rPr>
-                <w:rFonts w:ascii="Arial" w:hAnsi="Arial" w:eastAsia="Times"/>
+                <w:rFonts w:ascii="Times" w:hAnsi="Times" w:eastAsia="Times"/>
                 <w:b w:val="0"/>
                 <w:i w:val="0"/>
                 <w:color w:val="000000"/>
@@ -11916,7 +11910,7 @@
             </w:pPr>
             <w:r>
               <w:rPr>
-                <w:rFonts w:ascii="Arial" w:hAnsi="Arial" w:eastAsia="Times"/>
+                <w:rFonts w:ascii="Times" w:hAnsi="Times" w:eastAsia="Times"/>
                 <w:b w:val="0"/>
                 <w:i w:val="0"/>
                 <w:color w:val="000000"/>
@@ -11952,7 +11946,7 @@
             </w:pPr>
             <w:r>
               <w:rPr>
-                <w:rFonts w:ascii="Arial" w:hAnsi="Arial" w:eastAsia="Times"/>
+                <w:rFonts w:ascii="Times" w:hAnsi="Times" w:eastAsia="Times"/>
                 <w:b w:val="0"/>
                 <w:i w:val="0"/>
                 <w:color w:val="000000"/>
@@ -11993,7 +11987,7 @@
             </w:pPr>
             <w:r>
               <w:rPr>
-                <w:rFonts w:ascii="Arial" w:hAnsi="Arial" w:eastAsia="Times"/>
+                <w:rFonts w:ascii="Times" w:hAnsi="Times" w:eastAsia="Times"/>
                 <w:b w:val="0"/>
                 <w:i w:val="0"/>
                 <w:color w:val="000000"/>
@@ -12029,7 +12023,7 @@
             </w:pPr>
             <w:r>
               <w:rPr>
-                <w:rFonts w:ascii="Arial" w:hAnsi="Arial" w:eastAsia="Times"/>
+                <w:rFonts w:ascii="Times" w:hAnsi="Times" w:eastAsia="Times"/>
                 <w:b w:val="0"/>
                 <w:i w:val="0"/>
                 <w:color w:val="000000"/>
@@ -12065,7 +12059,7 @@
             </w:pPr>
             <w:r>
               <w:rPr>
-                <w:rFonts w:ascii="Arial" w:hAnsi="Arial" w:eastAsia="Times"/>
+                <w:rFonts w:ascii="Times" w:hAnsi="Times" w:eastAsia="Times"/>
                 <w:b w:val="0"/>
                 <w:i w:val="0"/>
                 <w:color w:val="000000"/>
@@ -12101,7 +12095,7 @@
             </w:pPr>
             <w:r>
               <w:rPr>
-                <w:rFonts w:ascii="Arial" w:hAnsi="Arial" w:eastAsia="Times"/>
+                <w:rFonts w:ascii="Times" w:hAnsi="Times" w:eastAsia="Times"/>
                 <w:b w:val="0"/>
                 <w:i w:val="0"/>
                 <w:color w:val="000000"/>
@@ -12137,7 +12131,7 @@
             </w:pPr>
             <w:r>
               <w:rPr>
-                <w:rFonts w:ascii="Arial" w:hAnsi="Arial" w:eastAsia="Times"/>
+                <w:rFonts w:ascii="Times" w:hAnsi="Times" w:eastAsia="Times"/>
                 <w:b w:val="0"/>
                 <w:i w:val="0"/>
                 <w:color w:val="000000"/>
@@ -12178,7 +12172,7 @@
             </w:pPr>
             <w:r>
               <w:rPr>
-                <w:rFonts w:ascii="Arial" w:hAnsi="Arial" w:eastAsia="Times"/>
+                <w:rFonts w:ascii="Times" w:hAnsi="Times" w:eastAsia="Times"/>
                 <w:b w:val="0"/>
                 <w:i w:val="0"/>
                 <w:color w:val="000000"/>
@@ -12214,7 +12208,7 @@
             </w:pPr>
             <w:r>
               <w:rPr>
-                <w:rFonts w:ascii="Arial" w:hAnsi="Arial" w:eastAsia="Times"/>
+                <w:rFonts w:ascii="Times" w:hAnsi="Times" w:eastAsia="Times"/>
                 <w:b w:val="0"/>
                 <w:i w:val="0"/>
                 <w:color w:val="000000"/>
@@ -12250,7 +12244,7 @@
             </w:pPr>
             <w:r>
               <w:rPr>
-                <w:rFonts w:ascii="Arial" w:hAnsi="Arial" w:eastAsia="Times"/>
+                <w:rFonts w:ascii="Times" w:hAnsi="Times" w:eastAsia="Times"/>
                 <w:b w:val="0"/>
                 <w:i w:val="0"/>
                 <w:color w:val="000000"/>
@@ -12286,7 +12280,7 @@
             </w:pPr>
             <w:r>
               <w:rPr>
-                <w:rFonts w:ascii="Arial" w:hAnsi="Arial" w:eastAsia="Times"/>
+                <w:rFonts w:ascii="Times" w:hAnsi="Times" w:eastAsia="Times"/>
                 <w:b w:val="0"/>
                 <w:i w:val="0"/>
                 <w:color w:val="000000"/>
@@ -12322,7 +12316,7 @@
             </w:pPr>
             <w:r>
               <w:rPr>
-                <w:rFonts w:ascii="Arial" w:hAnsi="Arial" w:eastAsia="Times"/>
+                <w:rFonts w:ascii="Times" w:hAnsi="Times" w:eastAsia="Times"/>
                 <w:b w:val="0"/>
                 <w:i w:val="0"/>
                 <w:color w:val="000000"/>
@@ -12363,7 +12357,7 @@
             </w:pPr>
             <w:r>
               <w:rPr>
-                <w:rFonts w:ascii="Arial" w:hAnsi="Arial" w:eastAsia="Times"/>
+                <w:rFonts w:ascii="Times" w:hAnsi="Times" w:eastAsia="Times"/>
                 <w:b w:val="0"/>
                 <w:i w:val="0"/>
                 <w:color w:val="000000"/>
@@ -12399,7 +12393,7 @@
             </w:pPr>
             <w:r>
               <w:rPr>
-                <w:rFonts w:ascii="Arial" w:hAnsi="Arial" w:eastAsia="Times"/>
+                <w:rFonts w:ascii="Times" w:hAnsi="Times" w:eastAsia="Times"/>
                 <w:b w:val="0"/>
                 <w:i w:val="0"/>
                 <w:color w:val="000000"/>
@@ -12435,7 +12429,7 @@
             </w:pPr>
             <w:r>
               <w:rPr>
-                <w:rFonts w:ascii="Arial" w:hAnsi="Arial" w:eastAsia="Times"/>
+                <w:rFonts w:ascii="Times" w:hAnsi="Times" w:eastAsia="Times"/>
                 <w:b w:val="0"/>
                 <w:i w:val="0"/>
                 <w:color w:val="000000"/>
@@ -12471,7 +12465,7 @@
             </w:pPr>
             <w:r>
               <w:rPr>
-                <w:rFonts w:ascii="Arial" w:hAnsi="Arial" w:eastAsia="Times"/>
+                <w:rFonts w:ascii="Times" w:hAnsi="Times" w:eastAsia="Times"/>
                 <w:b w:val="0"/>
                 <w:i w:val="0"/>
                 <w:color w:val="000000"/>
@@ -12507,7 +12501,7 @@
             </w:pPr>
             <w:r>
               <w:rPr>
-                <w:rFonts w:ascii="Arial" w:hAnsi="Arial" w:eastAsia="Times"/>
+                <w:rFonts w:ascii="Times" w:hAnsi="Times" w:eastAsia="Times"/>
                 <w:b w:val="0"/>
                 <w:i w:val="0"/>
                 <w:color w:val="000000"/>
@@ -12773,7 +12767,7 @@
             </w:pPr>
             <w:r>
               <w:rPr>
-                <w:rFonts w:ascii="Arial" w:hAnsi="Arial" w:eastAsia="Symbol"/>
+                <w:rFonts w:ascii="Symbol" w:hAnsi="Symbol" w:eastAsia="Symbol"/>
                 <w:b w:val="0"/>
                 <w:i w:val="0"/>
                 <w:color w:val="000000"/>
@@ -12809,7 +12803,7 @@
             </w:pPr>
             <w:r>
               <w:rPr>
-                <w:rFonts w:ascii="Arial" w:hAnsi="Arial" w:eastAsia="Times"/>
+                <w:rFonts w:ascii="Times" w:hAnsi="Times" w:eastAsia="Times"/>
                 <w:b/>
                 <w:i w:val="0"/>
                 <w:color w:val="000000"/>
@@ -12845,7 +12839,7 @@
             </w:pPr>
             <w:r>
               <w:rPr>
-                <w:rFonts w:ascii="Arial" w:hAnsi="Arial" w:eastAsia="Symbol"/>
+                <w:rFonts w:ascii="Symbol" w:hAnsi="Symbol" w:eastAsia="Symbol"/>
                 <w:b w:val="0"/>
                 <w:i w:val="0"/>
                 <w:color w:val="000000"/>
@@ -12855,7 +12849,7 @@
             </w:r>
             <w:r>
               <w:rPr>
-                <w:rFonts w:ascii="Arial" w:hAnsi="Arial" w:eastAsia="Times"/>
+                <w:rFonts w:ascii="Times" w:hAnsi="Times" w:eastAsia="Times"/>
                 <w:b/>
                 <w:i w:val="0"/>
                 <w:color w:val="000000"/>
@@ -12891,7 +12885,7 @@
             </w:pPr>
             <w:r>
               <w:rPr>
-                <w:rFonts w:ascii="Arial" w:hAnsi="Arial" w:eastAsia="Times"/>
+                <w:rFonts w:ascii="Times" w:hAnsi="Times" w:eastAsia="Times"/>
                 <w:b/>
                 <w:i w:val="0"/>
                 <w:color w:val="000000"/>
@@ -12901,7 +12895,7 @@
             </w:r>
             <w:r>
               <w:rPr>
-                <w:rFonts w:ascii="Arial" w:hAnsi="Arial" w:eastAsia="Symbol"/>
+                <w:rFonts w:ascii="Symbol" w:hAnsi="Symbol" w:eastAsia="Symbol"/>
                 <w:b w:val="0"/>
                 <w:i w:val="0"/>
                 <w:color w:val="000000"/>
@@ -12937,7 +12931,7 @@
             </w:pPr>
             <w:r>
               <w:rPr>
-                <w:rFonts w:ascii="Arial" w:hAnsi="Arial" w:eastAsia="Times"/>
+                <w:rFonts w:ascii="Times" w:hAnsi="Times" w:eastAsia="Times"/>
                 <w:b/>
                 <w:i w:val="0"/>
                 <w:color w:val="000000"/>
@@ -12978,7 +12972,7 @@
             </w:pPr>
             <w:r>
               <w:rPr>
-                <w:rFonts w:ascii="Arial" w:hAnsi="Arial" w:eastAsia="Symbol"/>
+                <w:rFonts w:ascii="Symbol" w:hAnsi="Symbol" w:eastAsia="Symbol"/>
                 <w:b w:val="0"/>
                 <w:i w:val="0"/>
                 <w:color w:val="000000"/>
@@ -13014,7 +13008,7 @@
             </w:pPr>
             <w:r>
               <w:rPr>
-                <w:rFonts w:ascii="Arial" w:hAnsi="Arial" w:eastAsia="Times"/>
+                <w:rFonts w:ascii="Times" w:hAnsi="Times" w:eastAsia="Times"/>
                 <w:b w:val="0"/>
                 <w:i w:val="0"/>
                 <w:color w:val="000000"/>
@@ -13050,7 +13044,7 @@
             </w:pPr>
             <w:r>
               <w:rPr>
-                <w:rFonts w:ascii="Arial" w:hAnsi="Arial" w:eastAsia="Times"/>
+                <w:rFonts w:ascii="Times" w:hAnsi="Times" w:eastAsia="Times"/>
                 <w:b w:val="0"/>
                 <w:i w:val="0"/>
                 <w:color w:val="000000"/>
@@ -13086,7 +13080,7 @@
             </w:pPr>
             <w:r>
               <w:rPr>
-                <w:rFonts w:ascii="Arial" w:hAnsi="Arial" w:eastAsia="Times"/>
+                <w:rFonts w:ascii="Times" w:hAnsi="Times" w:eastAsia="Times"/>
                 <w:b w:val="0"/>
                 <w:i w:val="0"/>
                 <w:color w:val="000000"/>
@@ -13122,7 +13116,7 @@
             </w:pPr>
             <w:r>
               <w:rPr>
-                <w:rFonts w:ascii="Arial" w:hAnsi="Arial" w:eastAsia="Times"/>
+                <w:rFonts w:ascii="Times" w:hAnsi="Times" w:eastAsia="Times"/>
                 <w:b w:val="0"/>
                 <w:i w:val="0"/>
                 <w:color w:val="000000"/>
@@ -13163,7 +13157,7 @@
             </w:pPr>
             <w:r>
               <w:rPr>
-                <w:rFonts w:ascii="Arial" w:hAnsi="Arial" w:eastAsia="Times"/>
+                <w:rFonts w:ascii="Times" w:hAnsi="Times" w:eastAsia="Times"/>
                 <w:b w:val="0"/>
                 <w:i w:val="0"/>
                 <w:color w:val="000000"/>
@@ -13199,7 +13193,7 @@
             </w:pPr>
             <w:r>
               <w:rPr>
-                <w:rFonts w:ascii="Arial" w:hAnsi="Arial" w:eastAsia="Times"/>
+                <w:rFonts w:ascii="Times" w:hAnsi="Times" w:eastAsia="Times"/>
                 <w:b w:val="0"/>
                 <w:i w:val="0"/>
                 <w:color w:val="000000"/>
@@ -13235,7 +13229,7 @@
             </w:pPr>
             <w:r>
               <w:rPr>
-                <w:rFonts w:ascii="Arial" w:hAnsi="Arial" w:eastAsia="Symbol"/>
+                <w:rFonts w:ascii="Symbol" w:hAnsi="Symbol" w:eastAsia="Symbol"/>
                 <w:b w:val="0"/>
                 <w:i w:val="0"/>
                 <w:color w:val="000000"/>
@@ -13245,7 +13239,7 @@
             </w:r>
             <w:r>
               <w:rPr>
-                <w:rFonts w:ascii="Arial" w:hAnsi="Arial" w:eastAsia="Times"/>
+                <w:rFonts w:ascii="Times" w:hAnsi="Times" w:eastAsia="Times"/>
                 <w:b w:val="0"/>
                 <w:i w:val="0"/>
                 <w:color w:val="000000"/>
@@ -13281,7 +13275,7 @@
             </w:pPr>
             <w:r>
               <w:rPr>
-                <w:rFonts w:ascii="Arial" w:hAnsi="Arial" w:eastAsia="Symbol"/>
+                <w:rFonts w:ascii="Symbol" w:hAnsi="Symbol" w:eastAsia="Symbol"/>
                 <w:b w:val="0"/>
                 <w:i w:val="0"/>
                 <w:color w:val="000000"/>
@@ -13291,7 +13285,7 @@
             </w:r>
             <w:r>
               <w:rPr>
-                <w:rFonts w:ascii="Arial" w:hAnsi="Arial" w:eastAsia="Times"/>
+                <w:rFonts w:ascii="Times" w:hAnsi="Times" w:eastAsia="Times"/>
                 <w:b w:val="0"/>
                 <w:i w:val="0"/>
                 <w:color w:val="000000"/>
@@ -13327,7 +13321,7 @@
             </w:pPr>
             <w:r>
               <w:rPr>
-                <w:rFonts w:ascii="Arial" w:hAnsi="Arial" w:eastAsia="Times"/>
+                <w:rFonts w:ascii="Times" w:hAnsi="Times" w:eastAsia="Times"/>
                 <w:b w:val="0"/>
                 <w:i w:val="0"/>
                 <w:color w:val="000000"/>
@@ -13368,7 +13362,7 @@
             </w:pPr>
             <w:r>
               <w:rPr>
-                <w:rFonts w:ascii="Arial" w:hAnsi="Arial" w:eastAsia="Times"/>
+                <w:rFonts w:ascii="Times" w:hAnsi="Times" w:eastAsia="Times"/>
                 <w:b w:val="0"/>
                 <w:i w:val="0"/>
                 <w:color w:val="000000"/>
@@ -13404,7 +13398,7 @@
             </w:pPr>
             <w:r>
               <w:rPr>
-                <w:rFonts w:ascii="Arial" w:hAnsi="Arial" w:eastAsia="Times"/>
+                <w:rFonts w:ascii="Times" w:hAnsi="Times" w:eastAsia="Times"/>
                 <w:b w:val="0"/>
                 <w:i w:val="0"/>
                 <w:color w:val="000000"/>
@@ -13440,7 +13434,7 @@
             </w:pPr>
             <w:r>
               <w:rPr>
-                <w:rFonts w:ascii="Arial" w:hAnsi="Arial" w:eastAsia="Symbol"/>
+                <w:rFonts w:ascii="Symbol" w:hAnsi="Symbol" w:eastAsia="Symbol"/>
                 <w:b w:val="0"/>
                 <w:i w:val="0"/>
                 <w:color w:val="000000"/>
@@ -13450,7 +13444,7 @@
             </w:r>
             <w:r>
               <w:rPr>
-                <w:rFonts w:ascii="Arial" w:hAnsi="Arial" w:eastAsia="Times"/>
+                <w:rFonts w:ascii="Times" w:hAnsi="Times" w:eastAsia="Times"/>
                 <w:b w:val="0"/>
                 <w:i w:val="0"/>
                 <w:color w:val="000000"/>
@@ -13486,7 +13480,7 @@
             </w:pPr>
             <w:r>
               <w:rPr>
-                <w:rFonts w:ascii="Arial" w:hAnsi="Arial" w:eastAsia="Symbol"/>
+                <w:rFonts w:ascii="Symbol" w:hAnsi="Symbol" w:eastAsia="Symbol"/>
                 <w:b w:val="0"/>
                 <w:i w:val="0"/>
                 <w:color w:val="000000"/>
@@ -13496,7 +13490,7 @@
             </w:r>
             <w:r>
               <w:rPr>
-                <w:rFonts w:ascii="Arial" w:hAnsi="Arial" w:eastAsia="Times"/>
+                <w:rFonts w:ascii="Times" w:hAnsi="Times" w:eastAsia="Times"/>
                 <w:b w:val="0"/>
                 <w:i w:val="0"/>
                 <w:color w:val="000000"/>
@@ -13532,7 +13526,7 @@
             </w:pPr>
             <w:r>
               <w:rPr>
-                <w:rFonts w:ascii="Arial" w:hAnsi="Arial" w:eastAsia="Times"/>
+                <w:rFonts w:ascii="Times" w:hAnsi="Times" w:eastAsia="Times"/>
                 <w:b w:val="0"/>
                 <w:i w:val="0"/>
                 <w:color w:val="000000"/>
@@ -13573,7 +13567,7 @@
             </w:pPr>
             <w:r>
               <w:rPr>
-                <w:rFonts w:ascii="Arial" w:hAnsi="Arial" w:eastAsia="Times"/>
+                <w:rFonts w:ascii="Times" w:hAnsi="Times" w:eastAsia="Times"/>
                 <w:b w:val="0"/>
                 <w:i w:val="0"/>
                 <w:color w:val="000000"/>
@@ -13609,7 +13603,7 @@
             </w:pPr>
             <w:r>
               <w:rPr>
-                <w:rFonts w:ascii="Arial" w:hAnsi="Arial" w:eastAsia="Times"/>
+                <w:rFonts w:ascii="Times" w:hAnsi="Times" w:eastAsia="Times"/>
                 <w:b w:val="0"/>
                 <w:i w:val="0"/>
                 <w:color w:val="000000"/>
@@ -13645,7 +13639,7 @@
             </w:pPr>
             <w:r>
               <w:rPr>
-                <w:rFonts w:ascii="Arial" w:hAnsi="Arial" w:eastAsia="Symbol"/>
+                <w:rFonts w:ascii="Symbol" w:hAnsi="Symbol" w:eastAsia="Symbol"/>
                 <w:b w:val="0"/>
                 <w:i w:val="0"/>
                 <w:color w:val="000000"/>
@@ -13655,7 +13649,7 @@
             </w:r>
             <w:r>
               <w:rPr>
-                <w:rFonts w:ascii="Arial" w:hAnsi="Arial" w:eastAsia="Times"/>
+                <w:rFonts w:ascii="Times" w:hAnsi="Times" w:eastAsia="Times"/>
                 <w:b w:val="0"/>
                 <w:i w:val="0"/>
                 <w:color w:val="000000"/>
@@ -13691,7 +13685,7 @@
             </w:pPr>
             <w:r>
               <w:rPr>
-                <w:rFonts w:ascii="Arial" w:hAnsi="Arial" w:eastAsia="Symbol"/>
+                <w:rFonts w:ascii="Symbol" w:hAnsi="Symbol" w:eastAsia="Symbol"/>
                 <w:b w:val="0"/>
                 <w:i w:val="0"/>
                 <w:color w:val="000000"/>
@@ -13701,7 +13695,7 @@
             </w:r>
             <w:r>
               <w:rPr>
-                <w:rFonts w:ascii="Arial" w:hAnsi="Arial" w:eastAsia="Times"/>
+                <w:rFonts w:ascii="Times" w:hAnsi="Times" w:eastAsia="Times"/>
                 <w:b w:val="0"/>
                 <w:i w:val="0"/>
                 <w:color w:val="000000"/>
@@ -13737,7 +13731,7 @@
             </w:pPr>
             <w:r>
               <w:rPr>
-                <w:rFonts w:ascii="Arial" w:hAnsi="Arial" w:eastAsia="Times"/>
+                <w:rFonts w:ascii="Times" w:hAnsi="Times" w:eastAsia="Times"/>
                 <w:b w:val="0"/>
                 <w:i w:val="0"/>
                 <w:color w:val="000000"/>
@@ -13778,7 +13772,7 @@
             </w:pPr>
             <w:r>
               <w:rPr>
-                <w:rFonts w:ascii="Arial" w:hAnsi="Arial" w:eastAsia="Times"/>
+                <w:rFonts w:ascii="Times" w:hAnsi="Times" w:eastAsia="Times"/>
                 <w:b w:val="0"/>
                 <w:i w:val="0"/>
                 <w:color w:val="000000"/>
@@ -13814,7 +13808,7 @@
             </w:pPr>
             <w:r>
               <w:rPr>
-                <w:rFonts w:ascii="Arial" w:hAnsi="Arial" w:eastAsia="Times"/>
+                <w:rFonts w:ascii="Times" w:hAnsi="Times" w:eastAsia="Times"/>
                 <w:b w:val="0"/>
                 <w:i w:val="0"/>
                 <w:color w:val="000000"/>
@@ -13850,7 +13844,7 @@
             </w:pPr>
             <w:r>
               <w:rPr>
-                <w:rFonts w:ascii="Arial" w:hAnsi="Arial" w:eastAsia="Symbol"/>
+                <w:rFonts w:ascii="Symbol" w:hAnsi="Symbol" w:eastAsia="Symbol"/>
                 <w:b w:val="0"/>
                 <w:i w:val="0"/>
                 <w:color w:val="000000"/>
@@ -13860,7 +13854,7 @@
             </w:r>
             <w:r>
               <w:rPr>
-                <w:rFonts w:ascii="Arial" w:hAnsi="Arial" w:eastAsia="Times"/>
+                <w:rFonts w:ascii="Times" w:hAnsi="Times" w:eastAsia="Times"/>
                 <w:b w:val="0"/>
                 <w:i w:val="0"/>
                 <w:color w:val="000000"/>
@@ -13896,7 +13890,7 @@
             </w:pPr>
             <w:r>
               <w:rPr>
-                <w:rFonts w:ascii="Arial" w:hAnsi="Arial" w:eastAsia="Symbol"/>
+                <w:rFonts w:ascii="Symbol" w:hAnsi="Symbol" w:eastAsia="Symbol"/>
                 <w:b w:val="0"/>
                 <w:i w:val="0"/>
                 <w:color w:val="000000"/>
@@ -13906,7 +13900,7 @@
             </w:r>
             <w:r>
               <w:rPr>
-                <w:rFonts w:ascii="Arial" w:hAnsi="Arial" w:eastAsia="Times"/>
+                <w:rFonts w:ascii="Times" w:hAnsi="Times" w:eastAsia="Times"/>
                 <w:b w:val="0"/>
                 <w:i w:val="0"/>
                 <w:color w:val="000000"/>
@@ -13942,7 +13936,7 @@
             </w:pPr>
             <w:r>
               <w:rPr>
-                <w:rFonts w:ascii="Arial" w:hAnsi="Arial" w:eastAsia="Times"/>
+                <w:rFonts w:ascii="Times" w:hAnsi="Times" w:eastAsia="Times"/>
                 <w:b w:val="0"/>
                 <w:i w:val="0"/>
                 <w:color w:val="000000"/>
@@ -14555,7 +14549,7 @@
             </w:pPr>
             <w:r>
               <w:rPr>
-                <w:rFonts w:ascii="Arial" w:hAnsi="Arial" w:eastAsia="Times"/>
+                <w:rFonts w:ascii="Times" w:hAnsi="Times" w:eastAsia="Times"/>
                 <w:b/>
                 <w:i w:val="0"/>
                 <w:color w:val="000000"/>
@@ -14591,7 +14585,7 @@
             </w:pPr>
             <w:r>
               <w:rPr>
-                <w:rFonts w:ascii="Arial" w:hAnsi="Arial" w:eastAsia="Times"/>
+                <w:rFonts w:ascii="Times" w:hAnsi="Times" w:eastAsia="Times"/>
                 <w:b/>
                 <w:i w:val="0"/>
                 <w:color w:val="000000"/>
@@ -14627,7 +14621,7 @@
             </w:pPr>
             <w:r>
               <w:rPr>
-                <w:rFonts w:ascii="Arial" w:hAnsi="Arial" w:eastAsia="Times"/>
+                <w:rFonts w:ascii="Times" w:hAnsi="Times" w:eastAsia="Times"/>
                 <w:b/>
                 <w:i w:val="0"/>
                 <w:color w:val="000000"/>
@@ -14668,7 +14662,7 @@
             </w:pPr>
             <w:r>
               <w:rPr>
-                <w:rFonts w:ascii="Arial" w:hAnsi="Arial" w:eastAsia="Times"/>
+                <w:rFonts w:ascii="Times" w:hAnsi="Times" w:eastAsia="Times"/>
                 <w:b w:val="0"/>
                 <w:i w:val="0"/>
                 <w:color w:val="000000"/>
@@ -14678,7 +14672,7 @@
             </w:r>
             <w:r>
               <w:rPr>
-                <w:rFonts w:ascii="Arial" w:hAnsi="Arial" w:eastAsia="Symbol"/>
+                <w:rFonts w:ascii="Symbol" w:hAnsi="Symbol" w:eastAsia="Symbol"/>
                 <w:b w:val="0"/>
                 <w:i w:val="0"/>
                 <w:color w:val="000000"/>
@@ -14688,7 +14682,7 @@
             </w:r>
             <w:r>
               <w:rPr>
-                <w:rFonts w:ascii="Arial" w:hAnsi="Arial" w:eastAsia="Times"/>
+                <w:rFonts w:ascii="Times" w:hAnsi="Times" w:eastAsia="Times"/>
                 <w:b w:val="0"/>
                 <w:i w:val="0"/>
                 <w:color w:val="000000"/>
@@ -14724,7 +14718,7 @@
             </w:pPr>
             <w:r>
               <w:rPr>
-                <w:rFonts w:ascii="Arial" w:hAnsi="Arial" w:eastAsia="Times"/>
+                <w:rFonts w:ascii="Times" w:hAnsi="Times" w:eastAsia="Times"/>
                 <w:b w:val="0"/>
                 <w:i w:val="0"/>
                 <w:color w:val="000000"/>
@@ -14734,7 +14728,7 @@
             </w:r>
             <w:r>
               <w:rPr>
-                <w:rFonts w:ascii="Arial" w:hAnsi="Arial" w:eastAsia="Symbol"/>
+                <w:rFonts w:ascii="Symbol" w:hAnsi="Symbol" w:eastAsia="Symbol"/>
                 <w:b w:val="0"/>
                 <w:i w:val="0"/>
                 <w:color w:val="000000"/>
@@ -14744,7 +14738,7 @@
             </w:r>
             <w:r>
               <w:rPr>
-                <w:rFonts w:ascii="Arial" w:hAnsi="Arial" w:eastAsia="Times"/>
+                <w:rFonts w:ascii="Times" w:hAnsi="Times" w:eastAsia="Times"/>
                 <w:b w:val="0"/>
                 <w:i w:val="0"/>
                 <w:color w:val="000000"/>
@@ -14754,7 +14748,7 @@
             </w:r>
             <w:r>
               <w:rPr>
-                <w:rFonts w:ascii="Arial" w:hAnsi="Arial" w:eastAsia="Symbol"/>
+                <w:rFonts w:ascii="Symbol" w:hAnsi="Symbol" w:eastAsia="Symbol"/>
                 <w:b w:val="0"/>
                 <w:i w:val="0"/>
                 <w:color w:val="000000"/>
@@ -14764,7 +14758,7 @@
             </w:r>
             <w:r>
               <w:rPr>
-                <w:rFonts w:ascii="Arial" w:hAnsi="Arial" w:eastAsia="Times"/>
+                <w:rFonts w:ascii="Times" w:hAnsi="Times" w:eastAsia="Times"/>
                 <w:b w:val="0"/>
                 <w:i w:val="0"/>
                 <w:color w:val="000000"/>
@@ -14774,7 +14768,7 @@
             </w:r>
             <w:r>
               <w:rPr>
-                <w:rFonts w:ascii="Arial" w:hAnsi="Arial" w:eastAsia="Symbol"/>
+                <w:rFonts w:ascii="Symbol" w:hAnsi="Symbol" w:eastAsia="Symbol"/>
                 <w:b w:val="0"/>
                 <w:i w:val="0"/>
                 <w:color w:val="000000"/>
@@ -14784,7 +14778,7 @@
             </w:r>
             <w:r>
               <w:rPr>
-                <w:rFonts w:ascii="Arial" w:hAnsi="Arial" w:eastAsia="Times"/>
+                <w:rFonts w:ascii="Times" w:hAnsi="Times" w:eastAsia="Times"/>
                 <w:b w:val="0"/>
                 <w:i w:val="0"/>
                 <w:color w:val="000000"/>
@@ -14820,7 +14814,7 @@
             </w:pPr>
             <w:r>
               <w:rPr>
-                <w:rFonts w:ascii="Arial" w:hAnsi="Arial" w:eastAsia="Times"/>
+                <w:rFonts w:ascii="Times" w:hAnsi="Times" w:eastAsia="Times"/>
                 <w:b w:val="0"/>
                 <w:i w:val="0"/>
                 <w:color w:val="000000"/>
@@ -14830,7 +14824,7 @@
             </w:r>
             <w:r>
               <w:rPr>
-                <w:rFonts w:ascii="Arial" w:hAnsi="Arial" w:eastAsia="Symbol"/>
+                <w:rFonts w:ascii="Symbol" w:hAnsi="Symbol" w:eastAsia="Symbol"/>
                 <w:b w:val="0"/>
                 <w:i w:val="0"/>
                 <w:color w:val="000000"/>
@@ -14840,7 +14834,7 @@
             </w:r>
             <w:r>
               <w:rPr>
-                <w:rFonts w:ascii="Arial" w:hAnsi="Arial" w:eastAsia="Times"/>
+                <w:rFonts w:ascii="Times" w:hAnsi="Times" w:eastAsia="Times"/>
                 <w:b w:val="0"/>
                 <w:i w:val="0"/>
                 <w:color w:val="000000"/>
@@ -14881,7 +14875,7 @@
             </w:pPr>
             <w:r>
               <w:rPr>
-                <w:rFonts w:ascii="Arial" w:hAnsi="Arial" w:eastAsia="Times"/>
+                <w:rFonts w:ascii="Times" w:hAnsi="Times" w:eastAsia="Times"/>
                 <w:b w:val="0"/>
                 <w:i w:val="0"/>
                 <w:color w:val="000000"/>
@@ -14891,7 +14885,7 @@
             </w:r>
             <w:r>
               <w:rPr>
-                <w:rFonts w:ascii="Arial" w:hAnsi="Arial" w:eastAsia="Times"/>
+                <w:rFonts w:ascii="Times" w:hAnsi="Times" w:eastAsia="Times"/>
                 <w:b w:val="0"/>
                 <w:i w:val="0"/>
                 <w:color w:val="000000"/>
@@ -14927,7 +14921,7 @@
             </w:pPr>
             <w:r>
               <w:rPr>
-                <w:rFonts w:ascii="Arial" w:hAnsi="Arial" w:eastAsia="Times"/>
+                <w:rFonts w:ascii="Times" w:hAnsi="Times" w:eastAsia="Times"/>
                 <w:b w:val="0"/>
                 <w:i w:val="0"/>
                 <w:color w:val="000000"/>
@@ -14936,14 +14930,11 @@
               <w:t xml:space="preserve">Dominant factor: 76% NDCG loss from </w:t>
             </w:r>
             <w:r>
-              <w:rPr>
-                <w:rFonts w:ascii="Arial" w:hAnsi="Arial"/>
-              </w:rPr>
               <w:br/>
             </w:r>
             <w:r>
               <w:rPr>
-                <w:rFonts w:ascii="Arial" w:hAnsi="Arial" w:eastAsia="Times"/>
+                <w:rFonts w:ascii="Times" w:hAnsi="Times" w:eastAsia="Times"/>
                 <w:b w:val="0"/>
                 <w:i w:val="0"/>
                 <w:color w:val="000000"/>
@@ -14979,7 +14970,7 @@
             </w:pPr>
             <w:r>
               <w:rPr>
-                <w:rFonts w:ascii="Arial" w:hAnsi="Arial" w:eastAsia="Times"/>
+                <w:rFonts w:ascii="Times" w:hAnsi="Times" w:eastAsia="Times"/>
                 <w:b w:val="0"/>
                 <w:i w:val="0"/>
                 <w:color w:val="000000"/>
@@ -14989,7 +14980,7 @@
             </w:r>
             <w:r>
               <w:rPr>
-                <w:rFonts w:ascii="Arial" w:hAnsi="Arial" w:eastAsia="Symbol"/>
+                <w:rFonts w:ascii="Symbol" w:hAnsi="Symbol" w:eastAsia="Symbol"/>
                 <w:b w:val="0"/>
                 <w:i w:val="0"/>
                 <w:color w:val="000000"/>
@@ -14999,7 +14990,7 @@
             </w:r>
             <w:r>
               <w:rPr>
-                <w:rFonts w:ascii="Arial" w:hAnsi="Arial" w:eastAsia="Times"/>
+                <w:rFonts w:ascii="Times" w:hAnsi="Times" w:eastAsia="Times"/>
                 <w:b w:val="0"/>
                 <w:i w:val="0"/>
                 <w:color w:val="000000"/>
@@ -15040,7 +15031,7 @@
             </w:pPr>
             <w:r>
               <w:rPr>
-                <w:rFonts w:ascii="Arial" w:hAnsi="Arial" w:eastAsia="Times"/>
+                <w:rFonts w:ascii="Times" w:hAnsi="Times" w:eastAsia="Times"/>
                 <w:b w:val="0"/>
                 <w:i w:val="0"/>
                 <w:color w:val="000000"/>
@@ -15076,7 +15067,7 @@
             </w:pPr>
             <w:r>
               <w:rPr>
-                <w:rFonts w:ascii="Arial" w:hAnsi="Arial" w:eastAsia="Times"/>
+                <w:rFonts w:ascii="Times" w:hAnsi="Times" w:eastAsia="Times"/>
                 <w:b w:val="0"/>
                 <w:i w:val="0"/>
                 <w:color w:val="000000"/>
@@ -15086,7 +15077,7 @@
             </w:r>
             <w:r>
               <w:rPr>
-                <w:rFonts w:ascii="Arial" w:hAnsi="Arial" w:eastAsia="Times"/>
+                <w:rFonts w:ascii="Times" w:hAnsi="Times" w:eastAsia="Times"/>
                 <w:b w:val="0"/>
                 <w:i w:val="0"/>
                 <w:color w:val="000000"/>
@@ -15096,7 +15087,7 @@
             </w:r>
             <w:r>
               <w:rPr>
-                <w:rFonts w:ascii="Arial" w:hAnsi="Arial" w:eastAsia="Symbol"/>
+                <w:rFonts w:ascii="Symbol" w:hAnsi="Symbol" w:eastAsia="Symbol"/>
                 <w:b w:val="0"/>
                 <w:i w:val="0"/>
                 <w:color w:val="000000"/>
@@ -15106,7 +15097,7 @@
             </w:r>
             <w:r>
               <w:rPr>
-                <w:rFonts w:ascii="Arial" w:hAnsi="Arial" w:eastAsia="Times"/>
+                <w:rFonts w:ascii="Times" w:hAnsi="Times" w:eastAsia="Times"/>
                 <w:b w:val="0"/>
                 <w:i w:val="0"/>
                 <w:color w:val="000000"/>
@@ -15142,7 +15133,7 @@
             </w:pPr>
             <w:r>
               <w:rPr>
-                <w:rFonts w:ascii="Arial" w:hAnsi="Arial" w:eastAsia="Times"/>
+                <w:rFonts w:ascii="Times" w:hAnsi="Times" w:eastAsia="Times"/>
                 <w:b w:val="0"/>
                 <w:i w:val="0"/>
                 <w:color w:val="000000"/>
@@ -15152,7 +15143,7 @@
             </w:r>
             <w:r>
               <w:rPr>
-                <w:rFonts w:ascii="Arial" w:hAnsi="Arial" w:eastAsia="Symbol"/>
+                <w:rFonts w:ascii="Symbol" w:hAnsi="Symbol" w:eastAsia="Symbol"/>
                 <w:b w:val="0"/>
                 <w:i w:val="0"/>
                 <w:color w:val="000000"/>
@@ -15162,7 +15153,7 @@
             </w:r>
             <w:r>
               <w:rPr>
-                <w:rFonts w:ascii="Arial" w:hAnsi="Arial" w:eastAsia="Times"/>
+                <w:rFonts w:ascii="Times" w:hAnsi="Times" w:eastAsia="Times"/>
                 <w:b w:val="0"/>
                 <w:i w:val="0"/>
                 <w:color w:val="000000"/>
@@ -15203,7 +15194,7 @@
             </w:pPr>
             <w:r>
               <w:rPr>
-                <w:rFonts w:ascii="Arial" w:hAnsi="Arial" w:eastAsia="Times"/>
+                <w:rFonts w:ascii="Times" w:hAnsi="Times" w:eastAsia="Times"/>
                 <w:b w:val="0"/>
                 <w:i w:val="0"/>
                 <w:color w:val="000000"/>
@@ -15239,7 +15230,7 @@
             </w:pPr>
             <w:r>
               <w:rPr>
-                <w:rFonts w:ascii="Arial" w:hAnsi="Arial" w:eastAsia="Times"/>
+                <w:rFonts w:ascii="Times" w:hAnsi="Times" w:eastAsia="Times"/>
                 <w:b w:val="0"/>
                 <w:i w:val="0"/>
                 <w:color w:val="000000"/>
@@ -15249,7 +15240,7 @@
             </w:r>
             <w:r>
               <w:rPr>
-                <w:rFonts w:ascii="Arial" w:hAnsi="Arial" w:eastAsia="Symbol"/>
+                <w:rFonts w:ascii="Symbol" w:hAnsi="Symbol" w:eastAsia="Symbol"/>
                 <w:b w:val="0"/>
                 <w:i w:val="0"/>
                 <w:color w:val="000000"/>
@@ -15259,7 +15250,7 @@
             </w:r>
             <w:r>
               <w:rPr>
-                <w:rFonts w:ascii="Arial" w:hAnsi="Arial" w:eastAsia="Times"/>
+                <w:rFonts w:ascii="Times" w:hAnsi="Times" w:eastAsia="Times"/>
                 <w:b w:val="0"/>
                 <w:i w:val="0"/>
                 <w:color w:val="000000"/>
@@ -15269,7 +15260,7 @@
             </w:r>
             <w:r>
               <w:rPr>
-                <w:rFonts w:ascii="Arial" w:hAnsi="Arial" w:eastAsia="Times"/>
+                <w:rFonts w:ascii="Times" w:hAnsi="Times" w:eastAsia="Times"/>
                 <w:b w:val="0"/>
                 <w:i w:val="0"/>
                 <w:color w:val="000000"/>
@@ -15305,7 +15296,7 @@
             </w:pPr>
             <w:r>
               <w:rPr>
-                <w:rFonts w:ascii="Arial" w:hAnsi="Arial" w:eastAsia="Times"/>
+                <w:rFonts w:ascii="Times" w:hAnsi="Times" w:eastAsia="Times"/>
                 <w:b w:val="0"/>
                 <w:i w:val="0"/>
                 <w:color w:val="000000"/>
@@ -15346,7 +15337,7 @@
             </w:pPr>
             <w:r>
               <w:rPr>
-                <w:rFonts w:ascii="Arial" w:hAnsi="Arial" w:eastAsia="Times"/>
+                <w:rFonts w:ascii="Times" w:hAnsi="Times" w:eastAsia="Times"/>
                 <w:b w:val="0"/>
                 <w:i w:val="0"/>
                 <w:color w:val="000000"/>
@@ -15382,7 +15373,7 @@
             </w:pPr>
             <w:r>
               <w:rPr>
-                <w:rFonts w:ascii="Arial" w:hAnsi="Arial" w:eastAsia="Times"/>
+                <w:rFonts w:ascii="Times" w:hAnsi="Times" w:eastAsia="Times"/>
                 <w:b w:val="0"/>
                 <w:i w:val="0"/>
                 <w:color w:val="000000"/>
@@ -15392,7 +15383,7 @@
             </w:r>
             <w:r>
               <w:rPr>
-                <w:rFonts w:ascii="Arial" w:hAnsi="Arial" w:eastAsia="Symbol"/>
+                <w:rFonts w:ascii="Symbol" w:hAnsi="Symbol" w:eastAsia="Symbol"/>
                 <w:b w:val="0"/>
                 <w:i w:val="0"/>
                 <w:color w:val="000000"/>
@@ -15402,7 +15393,7 @@
             </w:r>
             <w:r>
               <w:rPr>
-                <w:rFonts w:ascii="Arial" w:hAnsi="Arial" w:eastAsia="Times"/>
+                <w:rFonts w:ascii="Times" w:hAnsi="Times" w:eastAsia="Times"/>
                 <w:b w:val="0"/>
                 <w:i w:val="0"/>
                 <w:color w:val="000000"/>
@@ -15412,7 +15403,7 @@
             </w:r>
             <w:r>
               <w:rPr>
-                <w:rFonts w:ascii="Arial" w:hAnsi="Arial" w:eastAsia="Times"/>
+                <w:rFonts w:ascii="Times" w:hAnsi="Times" w:eastAsia="Times"/>
                 <w:b w:val="0"/>
                 <w:i w:val="0"/>
                 <w:color w:val="000000"/>
@@ -15448,7 +15439,7 @@
             </w:pPr>
             <w:r>
               <w:rPr>
-                <w:rFonts w:ascii="Arial" w:hAnsi="Arial" w:eastAsia="Times"/>
+                <w:rFonts w:ascii="Times" w:hAnsi="Times" w:eastAsia="Times"/>
                 <w:b w:val="0"/>
                 <w:i w:val="0"/>
                 <w:color w:val="000000"/>
@@ -15458,7 +15449,7 @@
             </w:r>
             <w:r>
               <w:rPr>
-                <w:rFonts w:ascii="Arial" w:hAnsi="Arial" w:eastAsia="Symbol"/>
+                <w:rFonts w:ascii="Symbol" w:hAnsi="Symbol" w:eastAsia="Symbol"/>
                 <w:b w:val="0"/>
                 <w:i w:val="0"/>
                 <w:color w:val="000000"/>
@@ -15468,7 +15459,7 @@
             </w:r>
             <w:r>
               <w:rPr>
-                <w:rFonts w:ascii="Arial" w:hAnsi="Arial" w:eastAsia="Times"/>
+                <w:rFonts w:ascii="Times" w:hAnsi="Times" w:eastAsia="Times"/>
                 <w:b w:val="0"/>
                 <w:i w:val="0"/>
                 <w:color w:val="000000"/>
@@ -15478,7 +15469,7 @@
             </w:r>
             <w:r>
               <w:rPr>
-                <w:rFonts w:ascii="Arial" w:hAnsi="Arial" w:eastAsia="Symbol"/>
+                <w:rFonts w:ascii="Symbol" w:hAnsi="Symbol" w:eastAsia="Symbol"/>
                 <w:b w:val="0"/>
                 <w:i w:val="0"/>
                 <w:color w:val="000000"/>

</xml_diff>